<commit_message>
Refactor: Dashboard basico simplificado y reporte de instalacion actualizado
</commit_message>
<xml_diff>
--- a/Reporte_Instalacion_Shiny_y_Despliegue_Posit.docx
+++ b/Reporte_Instalacion_Shiny_y_Despliegue_Posit.docx
@@ -15,22 +15,22 @@
         </w:rPr>
         <w:t>PROGRAMACIÓN EN CIENCIA DE DATOS</w:t>
         <w:br/>
-        <w:t>ACTIVIDAD PRÁCTICA DE LABORATORIO</w:t>
+        <w:t>REPORTE DE ACTIVIDAD PRÁCTICA</w:t>
       </w:r>
     </w:p>
     <w:p>
       <w:pPr>
-        <w:spacing w:before="360" w:after="280"/>
+        <w:spacing w:before="360" w:after="240"/>
         <w:jc w:val="center"/>
       </w:pPr>
       <w:r>
         <w:rPr>
           <w:rFonts w:ascii="Calibri" w:hAnsi="Calibri"/>
           <w:b/>
-          <w:color w:val="1A56DB"/>
+          <w:color w:val="1E40AF"/>
           <w:sz w:val="40"/>
         </w:rPr>
-        <w:t>INSTALACIÓN DE SHINY, CONSTRUCCIÓN DE UN DASHBOARD BÁSICO INTERACTIVO Y DESPLIEGUE EN LA NUBE (POSIT / SHINYAPPS.IO)</w:t>
+        <w:t>INSTALACIÓN DE SHINY, DESARROLLO DE UN DASHBOARD BÁSICO Y PUBLICACIÓN EN LA NUBE (POSIT)</w:t>
       </w:r>
     </w:p>
     <w:p>
@@ -44,12 +44,12 @@
           <w:color w:val="64748B"/>
           <w:sz w:val="22"/>
         </w:rPr>
-        <w:t>Guía Detallada Paso a Paso con Código Fuente, Tramitación de Cuenta y Evidencias de Ejecución</w:t>
+        <w:t>Guía Paso a Paso de Instalación, Código Fuente del Dashboard y Despliegue en Posit Connect Cloud</w:t>
       </w:r>
     </w:p>
     <w:p>
       <w:pPr>
-        <w:spacing w:after="320"/>
+        <w:spacing w:after="280"/>
       </w:pPr>
     </w:p>
     <w:tbl>
@@ -88,7 +88,7 @@
               <w:rPr>
                 <w:sz w:val="19"/>
               </w:rPr>
-              <w:t>Instalación de Shiny, Creación de Dashboard y Despliegue en Posit</w:t>
+              <w:t>Instalación de Shiny, Dashboard Básico y Publicación en Internet</w:t>
             </w:r>
           </w:p>
         </w:tc>
@@ -105,7 +105,7 @@
                 <w:b/>
                 <w:sz w:val="19"/>
               </w:rPr>
-              <w:t>Herramientas:</w:t>
+              <w:t>Usuario / Cuenta Posit:</w:t>
             </w:r>
           </w:p>
         </w:tc>
@@ -119,7 +119,7 @@
               <w:rPr>
                 <w:sz w:val="19"/>
               </w:rPr>
-              <w:t>Python 3.11, Shiny for Python (v1.8.0), rsconnect-python, shinyapps.io</w:t>
+              <w:t>rncm11 (https://connect.posit.cloud/rncm11)</w:t>
             </w:r>
           </w:p>
         </w:tc>
@@ -136,7 +136,7 @@
                 <w:b/>
                 <w:sz w:val="19"/>
               </w:rPr>
-              <w:t>Aplicación Desarrollada:</w:t>
+              <w:t>Repositorio GitHub:</w:t>
             </w:r>
           </w:p>
         </w:tc>
@@ -150,7 +150,38 @@
               <w:rPr>
                 <w:sz w:val="19"/>
               </w:rPr>
-              <w:t>Dashboard Interactivo de Rendimiento Comercial y Ventas</w:t>
+              <w:t>https://github.com/RolandoCastillo11/Shiny-Prog-CD</w:t>
+            </w:r>
+          </w:p>
+        </w:tc>
+      </w:tr>
+      <w:tr>
+        <w:tc>
+          <w:tcPr>
+            <w:tcW w:type="dxa" w:w="4680"/>
+            <w:shd w:fill="E2E8F0"/>
+          </w:tcPr>
+          <w:p>
+            <w:r>
+              <w:rPr>
+                <w:b/>
+                <w:sz w:val="19"/>
+              </w:rPr>
+              <w:t>Herramientas Utilizadas:</w:t>
+            </w:r>
+          </w:p>
+        </w:tc>
+        <w:tc>
+          <w:tcPr>
+            <w:tcW w:type="dxa" w:w="4680"/>
+            <w:shd w:fill="F8FAFC"/>
+          </w:tcPr>
+          <w:p>
+            <w:r>
+              <w:rPr>
+                <w:sz w:val="19"/>
+              </w:rPr>
+              <w:t>Python 3.11, Shiny for Python (v1.8.0), Posit Connect Cloud, Git</w:t>
             </w:r>
           </w:p>
         </w:tc>
@@ -201,19 +232,8 @@
       </w:r>
     </w:p>
     <w:p>
-      <w:pPr>
-        <w:spacing w:line="276" w:lineRule="auto"/>
-      </w:pPr>
       <w:r>
-        <w:t>El desarrollo de soluciones efectivas en Ciencia de Datos no termina con el entrenamiento de modelos o la formulación de consultas analíticas; culmina cuando los hallazgos y modelos son accesibles para los usuarios finales, analistas de negocio y tomadores de decisiones a través de interfaces visuales interactivas.</w:t>
-      </w:r>
-    </w:p>
-    <w:p>
-      <w:pPr>
-        <w:spacing w:line="276" w:lineRule="auto"/>
-      </w:pPr>
-      <w:r>
-        <w:t>Shiny es un marco de trabajo (framework) reactivo líder en la industria, desarrollado originalmente por Posit (antes RStudio). Tradicionalmente exclusivo del lenguaje R, Shiny ahora cuenta con soporte nativo de primera clase para Python (denominado Shiny for Python), combinando la potencia científica del ecosistema Python (NumPy, Pandas, Scikit-Learn, Matplotlib) con la elegancia reactiva y arquitectura declarativa de Shiny.</w:t>
+        <w:t>El propósito fundamental de esta actividad es familiarizarse con el framework Shiny for Python, aprender a estructurar un tablero analítico básico e interactivo, tramitar una cuenta en la infraestructura en la nube de Posit y desplegar la aplicación para que sea accesible públicamente a través de internet.</w:t>
       </w:r>
     </w:p>
     <w:p>
@@ -221,32 +241,32 @@
         <w:rPr>
           <w:b/>
         </w:rPr>
-        <w:t>Objetivos de la Práctica:</w:t>
+        <w:t>Objetivos Específicos:</w:t>
         <w:br/>
       </w:r>
       <w:r>
-        <w:t xml:space="preserve">  1. Instalar y configurar Shiny for Python y sus herramientas de soporte en el entorno local.</w:t>
+        <w:t>1. Instalar Shiny for Python y sus dependencias en el entorno local de desarrollo.</w:t>
         <w:br/>
       </w:r>
       <w:r>
-        <w:t xml:space="preserve">  2. Diseñar e implementar un Dashboard Básico interactivo con controles reactivos, indicadores KPI, visualizaciones gráficas y explorador de datos.</w:t>
+        <w:t>2. Crear un Dashboard Básico que demuestre la reactividad de Shiny mediante entradas, tarjetas estadísticas (Value Boxes), un gráfico interactivo y una tabla de datos.</w:t>
         <w:br/>
       </w:r>
       <w:r>
-        <w:t xml:space="preserve">  3. Tramitar y configurar una cuenta de publicación gratuita en la plataforma en la nube Posit (shinyapps.io).</w:t>
+        <w:t>3. Tramitar y configurar la cuenta de publicación en Posit Connect Cloud (cuenta: rncm11).</w:t>
         <w:br/>
       </w:r>
       <w:r>
-        <w:t xml:space="preserve">  4. Desplegar la aplicación web a internet mediante rsconnect-python, obteniendo un enlace público permanente y funcional.</w:t>
+        <w:t>4. Crear y sincronizar el repositorio en GitHub (RolandoCastillo11/Shiny-Prog-CD).</w:t>
         <w:br/>
       </w:r>
       <w:r>
-        <w:t xml:space="preserve">  5. Elaborar la documentación integral con fundamentos técnicos, código y comandos reproducibles.</w:t>
+        <w:t>5. Publicar el dashboard en internet y documentar los resultados.</w:t>
       </w:r>
     </w:p>
     <w:p>
       <w:pPr>
-        <w:spacing w:before="160"/>
+        <w:spacing w:before="120"/>
       </w:pPr>
     </w:p>
     <w:p>
@@ -256,7 +276,7 @@
       <w:r>
         <w:drawing>
           <wp:inline xmlns:a="http://schemas.openxmlformats.org/drawingml/2006/main" xmlns:pic="http://schemas.openxmlformats.org/drawingml/2006/picture">
-            <wp:extent cx="5852160" cy="1419422"/>
+            <wp:extent cx="5852160" cy="1298179"/>
             <wp:docPr id="1" name="Picture 1"/>
             <wp:cNvGraphicFramePr>
               <a:graphicFrameLocks noChangeAspect="1"/>
@@ -265,7 +285,7 @@
               <a:graphicData uri="http://schemas.openxmlformats.org/drawingml/2006/picture">
                 <pic:pic>
                   <pic:nvPicPr>
-                    <pic:cNvPr id="0" name="flujo_despliegue.png"/>
+                    <pic:cNvPr id="0" name="flujo_actividad.png"/>
                     <pic:cNvPicPr/>
                   </pic:nvPicPr>
                   <pic:blipFill>
@@ -277,7 +297,7 @@
                   <pic:spPr>
                     <a:xfrm>
                       <a:off x="0" y="0"/>
-                      <a:ext cx="5852160" cy="1419422"/>
+                      <a:ext cx="5852160" cy="1298179"/>
                     </a:xfrm>
                     <a:prstGeom prst="rect"/>
                   </pic:spPr>
@@ -293,7 +313,7 @@
         <w:jc w:val="center"/>
       </w:pPr>
       <w:r>
-        <w:t>Figura 1: Flujo integral de trabajo desde la instalación local hasta el hosting público en la nube.</w:t>
+        <w:t>Figura 1: Fases secuenciales de la actividad práctica.</w:t>
       </w:r>
     </w:p>
     <w:p>
@@ -301,12 +321,12 @@
         <w:pStyle w:val="Heading1"/>
       </w:pPr>
       <w:r>
-        <w:t>2. Fase de Instalación y Configuración del Entorno</w:t>
+        <w:t>2. Pasos para la Instalación de Shiny</w:t>
       </w:r>
     </w:p>
     <w:p>
       <w:r>
-        <w:t>Para llevar a cabo la actividad, se configuró el entorno en Python 3.11 en sistema operativo Windows. La instalación de Shiny y del conector de Posit se realiza de manera limpia mediante el gestor oficial pip.</w:t>
+        <w:t>Shiny for Python es el paquete oficial desarrollado por Posit para construir aplicaciones web reactivas en Python. La instalación se realiza a través de la terminal o consola de comandos (PowerShell / CMD) mediante pip:</w:t>
       </w:r>
     </w:p>
     <w:p>
@@ -314,25 +334,8 @@
         <w:rPr>
           <w:b/>
         </w:rPr>
-        <w:t>Paso 2.1: Instalación de Shiny for Python</w:t>
+        <w:t>Paso 2.1: Instalación de Shiny y librerías analíticas básicas</w:t>
         <w:br/>
-      </w:r>
-      <w:r>
-        <w:t>Shiny se instala ejecutando el siguiente comando en la consola o terminal (PowerShell / CMD):</w:t>
-      </w:r>
-    </w:p>
-    <w:p>
-      <w:pPr>
-        <w:spacing w:before="80" w:after="120"/>
-        <w:ind w:left="576"/>
-      </w:pPr>
-      <w:r>
-        <w:rPr>
-          <w:rFonts w:ascii="Consolas" w:hAnsi="Consolas"/>
-          <w:color w:val="1E293B"/>
-          <w:sz w:val="18"/>
-        </w:rPr>
-        <w:t>pip install shiny</w:t>
       </w:r>
     </w:p>
     <w:tbl>
@@ -362,7 +365,7 @@
                 <w:color w:val="0F172A"/>
                 <w:sz w:val="17"/>
               </w:rPr>
-              <w:t>pip install shiny</w:t>
+              <w:t>pip install shiny numpy pandas matplotlib rsconnect-python</w:t>
             </w:r>
           </w:p>
         </w:tc>
@@ -378,160 +381,11 @@
         <w:rPr>
           <w:b/>
         </w:rPr>
-        <w:t>Paso 2.2: Instalación de las Herramientas de Despliegue de Posit (rsconnect-python)</w:t>
+        <w:t>Paso 2.2: Comprobación de la instalación</w:t>
         <w:br/>
       </w:r>
       <w:r>
-        <w:t>Para conectar la máquina de desarrollo con la infraestructura en la nube de Posit (shinyapps.io y Posit Connect), se requiere la herramienta oficial rsconnect-python:</w:t>
-      </w:r>
-    </w:p>
-    <w:p>
-      <w:pPr>
-        <w:spacing w:before="80" w:after="120"/>
-        <w:ind w:left="576"/>
-      </w:pPr>
-      <w:r>
-        <w:rPr>
-          <w:rFonts w:ascii="Consolas" w:hAnsi="Consolas"/>
-          <w:color w:val="1E293B"/>
-          <w:sz w:val="18"/>
-        </w:rPr>
-        <w:t>pip install rsconnect-python</w:t>
-      </w:r>
-    </w:p>
-    <w:tbl>
-      <w:tblPr>
-        <w:tblW w:type="auto" w:w="0"/>
-        <w:jc w:val="center"/>
-        <w:tblLayout w:type="fixed"/>
-        <w:tblLook w:firstColumn="1" w:firstRow="1" w:lastColumn="0" w:lastRow="0" w:noHBand="0" w:noVBand="1" w:val="04A0"/>
-      </w:tblPr>
-      <w:tblGrid>
-        <w:gridCol w:w="9360"/>
-      </w:tblGrid>
-      <w:tr>
-        <w:tc>
-          <w:tcPr>
-            <w:tcW w:type="dxa" w:w="9360"/>
-            <w:shd w:fill="F1F5F9"/>
-          </w:tcPr>
-          <w:p>
-            <w:pPr>
-              <w:spacing w:before="80" w:after="80"/>
-            </w:pPr>
-            <w:r/>
-            <w:r>
-              <w:rPr>
-                <w:rFonts w:ascii="Consolas" w:hAnsi="Consolas"/>
-                <w:color w:val="0F172A"/>
-                <w:sz w:val="17"/>
-              </w:rPr>
-              <w:t>pip install rsconnect-python</w:t>
-            </w:r>
-          </w:p>
-        </w:tc>
-      </w:tr>
-    </w:tbl>
-    <w:p>
-      <w:pPr>
-        <w:spacing w:before="40" w:after="40"/>
-      </w:pPr>
-    </w:p>
-    <w:p>
-      <w:r>
-        <w:rPr>
-          <w:b/>
-        </w:rPr>
-        <w:t>Paso 2.3: Instalación de Librerías Analíticas Complementarias</w:t>
-        <w:br/>
-      </w:r>
-      <w:r>
-        <w:t>Para nutrir el dashboard de procesamiento matricial y gráficas estadísticas modernas:</w:t>
-      </w:r>
-    </w:p>
-    <w:p>
-      <w:pPr>
-        <w:spacing w:before="80" w:after="120"/>
-        <w:ind w:left="576"/>
-      </w:pPr>
-      <w:r>
-        <w:rPr>
-          <w:rFonts w:ascii="Consolas" w:hAnsi="Consolas"/>
-          <w:color w:val="1E293B"/>
-          <w:sz w:val="18"/>
-        </w:rPr>
-        <w:t>pip install pandas numpy matplotlib seaborn</w:t>
-      </w:r>
-    </w:p>
-    <w:tbl>
-      <w:tblPr>
-        <w:tblW w:type="auto" w:w="0"/>
-        <w:jc w:val="center"/>
-        <w:tblLayout w:type="fixed"/>
-        <w:tblLook w:firstColumn="1" w:firstRow="1" w:lastColumn="0" w:lastRow="0" w:noHBand="0" w:noVBand="1" w:val="04A0"/>
-      </w:tblPr>
-      <w:tblGrid>
-        <w:gridCol w:w="9360"/>
-      </w:tblGrid>
-      <w:tr>
-        <w:tc>
-          <w:tcPr>
-            <w:tcW w:type="dxa" w:w="9360"/>
-            <w:shd w:fill="F1F5F9"/>
-          </w:tcPr>
-          <w:p>
-            <w:pPr>
-              <w:spacing w:before="80" w:after="80"/>
-            </w:pPr>
-            <w:r/>
-            <w:r>
-              <w:rPr>
-                <w:rFonts w:ascii="Consolas" w:hAnsi="Consolas"/>
-                <w:color w:val="0F172A"/>
-                <w:sz w:val="17"/>
-              </w:rPr>
-              <w:t>pip install pandas numpy matplotlib seaborn</w:t>
-            </w:r>
-          </w:p>
-        </w:tc>
-      </w:tr>
-    </w:tbl>
-    <w:p>
-      <w:pPr>
-        <w:spacing w:before="40" w:after="40"/>
-      </w:pPr>
-    </w:p>
-    <w:p>
-      <w:r>
-        <w:rPr>
-          <w:b/>
-        </w:rPr>
-        <w:t>Paso 2.4: Verificación de la Instalación</w:t>
-        <w:br/>
-      </w:r>
-      <w:r>
-        <w:t>Se verificó la versión instalada en la terminal ejecutando:</w:t>
-      </w:r>
-    </w:p>
-    <w:p>
-      <w:pPr>
-        <w:spacing w:before="80" w:after="120"/>
-        <w:ind w:left="576"/>
-      </w:pPr>
-      <w:r>
-        <w:rPr>
-          <w:rFonts w:ascii="Consolas" w:hAnsi="Consolas"/>
-          <w:color w:val="1E293B"/>
-          <w:sz w:val="18"/>
-        </w:rPr>
-        <w:t>shiny --version</w:t>
-        <w:br/>
-        <w:t># Salida esperada: shiny, version 1.8.0</w:t>
-        <w:br/>
-        <w:br/>
-        <w:t>rsconnect version</w:t>
-        <w:br/>
-        <w:t># Salida esperada: 1.32.0</w:t>
+        <w:t>Para confirmar que Shiny se instaló correctamente y conocer la versión instalada, se ejecuta:</w:t>
       </w:r>
     </w:p>
     <w:tbl>
@@ -563,12 +417,12 @@
               </w:rPr>
               <w:t>shiny --version</w:t>
               <w:br/>
-              <w:t># Salida esperada: shiny, version 1.8.0</w:t>
+              <w:t># Resultado en consola: shiny, version 1.8.0</w:t>
               <w:br/>
               <w:br/>
-              <w:t>rsconnect version</w:t>
+              <w:t>python --version</w:t>
               <w:br/>
-              <w:t># Salida esperada: 1.32.0</w:t>
+              <w:t># Resultado: Python 3.11.0</w:t>
             </w:r>
           </w:p>
         </w:tc>
@@ -584,12 +438,12 @@
         <w:pStyle w:val="Heading1"/>
       </w:pPr>
       <w:r>
-        <w:t>3. Diseño y Construcción del Dashboard Básico</w:t>
+        <w:t>3. Desarrollo del Dashboard Básico</w:t>
       </w:r>
     </w:p>
     <w:p>
       <w:r>
-        <w:t>Se desarrolló un Dashboard analítico moderno orientado a la toma de decisiones comerciales: 'Dashboard de Rendimiento Comercial y Ventas'. El proyecto se estructuró de forma autocontenida y modular.</w:t>
+        <w:t>Siguiendo el requerimiento de crear un dashboard básico, claro y sin sobrecargas, se implementó una aplicación que permite explorar distribuciones estadísticas en tiempo real: 'Generador de Distribuciones Estadísticas'.</w:t>
       </w:r>
     </w:p>
     <w:p>
@@ -597,29 +451,7 @@
         <w:pStyle w:val="Heading2"/>
       </w:pPr>
       <w:r>
-        <w:t>3.1 Estructura del Proyecto</w:t>
-      </w:r>
-    </w:p>
-    <w:p>
-      <w:pPr>
-        <w:spacing w:before="80" w:after="120"/>
-        <w:ind w:left="576"/>
-      </w:pPr>
-      <w:r>
-        <w:rPr>
-          <w:rFonts w:ascii="Consolas" w:hAnsi="Consolas"/>
-          <w:color w:val="1E293B"/>
-          <w:sz w:val="18"/>
-        </w:rPr>
-        <w:t>Dashboard_Basico_Shiny/</w:t>
-        <w:br/>
-        <w:t>├── app.py             # Código fuente principal (UI + Server)</w:t>
-        <w:br/>
-        <w:t>├── requirements.txt   # Dependencias para el contenedor en Posit</w:t>
-        <w:br/>
-        <w:t>├── manifest.json      # Manifiesto de compilación generado por rsconnect</w:t>
-        <w:br/>
-        <w:t>└── README.md          # Instrucciones rápidas de uso y comandos</w:t>
+        <w:t>3.1 Estructura de Archivos del Proyecto</w:t>
       </w:r>
     </w:p>
     <w:tbl>
@@ -651,13 +483,15 @@
               </w:rPr>
               <w:t>Dashboard_Basico_Shiny/</w:t>
               <w:br/>
-              <w:t>├── app.py             # Código fuente principal (UI + Server)</w:t>
+              <w:t>├── app.py             # Código fuente de la aplicación básica (UI + Server)</w:t>
               <w:br/>
-              <w:t>├── requirements.txt   # Dependencias para el contenedor en Posit</w:t>
+              <w:t>├── requirements.txt   # Librerías mínimas necesarias para Posit (shiny, numpy, pandas, matplotlib)</w:t>
               <w:br/>
-              <w:t>├── manifest.json      # Manifiesto de compilación generado por rsconnect</w:t>
+              <w:t>├── README.md          # Documentación del proyecto en GitHub</w:t>
               <w:br/>
-              <w:t>└── README.md          # Instrucciones rápidas de uso y comandos</w:t>
+              <w:t>├── .gitignore         # Archivos excluidos del control de versiones</w:t>
+              <w:br/>
+              <w:t>└── manifest.json      # Manifiesto de compilación generado por rsconnect</w:t>
             </w:r>
           </w:p>
         </w:tc>
@@ -673,12 +507,7 @@
         <w:pStyle w:val="Heading2"/>
       </w:pPr>
       <w:r>
-        <w:t>3.2 Componentes de la Interfaz de Usuario (UI)</w:t>
-      </w:r>
-    </w:p>
-    <w:p>
-      <w:r>
-        <w:t>La interfaz utiliza la directiva moderna page_sidebar de Shiny, garantizando responsividad y limpieza estética:</w:t>
+        <w:t>3.2 Componentes del Dashboard Básico</w:t>
       </w:r>
     </w:p>
     <w:p>
@@ -686,40 +515,40 @@
         <w:rPr>
           <w:b/>
         </w:rPr>
-        <w:t xml:space="preserve">• Barra Lateral (Sidebar): </w:t>
+        <w:t xml:space="preserve">• Controles de Entrada (Sidebar): </w:t>
       </w:r>
       <w:r>
-        <w:t>Aloja los controles reactivos: selector múltiple de categorías (Tecnología, Mobiliario, Papelería, etc.), slider interactivo de rangos de importe de venta en dólares, y selector de desglose geográfico o por producto.</w:t>
+        <w:t>Un control deslizante (slider) para elegir el número de muestras N (de 20 a 500), un selector desplegable para elegir la distribución (Normal, Uniforme o Exponencial) y botones de opción para personalizar el color del gráfico.</w:t>
         <w:br/>
       </w:r>
       <w:r>
         <w:rPr>
           <w:b/>
         </w:rPr>
-        <w:t xml:space="preserve">• Tarjetas de Indicadores Clave (Value Boxes): </w:t>
+        <w:t xml:space="preserve">• Tarjetas de Indicadores (Value Boxes): </w:t>
       </w:r>
       <w:r>
-        <w:t>Muestran en tiempo real Ventas Totales ($ USD), Ticket Promedio, Total de Transacciones y Calificación Media de Satisfacción.</w:t>
+        <w:t>Tres tarjetas numéricas que calculan dinámicamente la Media Aritmética (x̄), la Desviación Estándar (σ) y el Total de observaciones.</w:t>
         <w:br/>
       </w:r>
       <w:r>
         <w:rPr>
           <w:b/>
         </w:rPr>
-        <w:t xml:space="preserve">• Gráficos Estadísticos: </w:t>
+        <w:t xml:space="preserve">• Gráfico Interactivo (Histograma): </w:t>
       </w:r>
       <w:r>
-        <w:t>Un gráfico de barras con ingresos acumulados por región y un gráfico de dispersión multifactorial relacionando ventas, satisfacción y unidades vendidas.</w:t>
+        <w:t>Muestra la distribución de frecuencias generada con Matplotlib, actualizándose al instante ante cualquier cambio del usuario.</w:t>
         <w:br/>
       </w:r>
       <w:r>
         <w:rPr>
           <w:b/>
         </w:rPr>
-        <w:t xml:space="preserve">• Explorador de Datos Dinámico: </w:t>
+        <w:t xml:space="preserve">• Tabla de Datos: </w:t>
       </w:r>
       <w:r>
-        <w:t>Tabla interactiva (render.data_frame / DataGrid) que filtra automáticamente los registros conforme el usuario manipula los controles.</w:t>
+        <w:t>Una tabla limpia que presenta las primeras 10 observaciones generadas.</w:t>
       </w:r>
     </w:p>
     <w:p>
@@ -727,19 +556,169 @@
         <w:pStyle w:val="Heading2"/>
       </w:pPr>
       <w:r>
-        <w:t>3.3 Lógica Reactiva del Servidor (Server)</w:t>
+        <w:t>3.3 Código Fuente Completo de app.py</w:t>
       </w:r>
     </w:p>
+    <w:tbl>
+      <w:tblPr>
+        <w:tblW w:type="auto" w:w="0"/>
+        <w:jc w:val="center"/>
+        <w:tblLayout w:type="fixed"/>
+        <w:tblLook w:firstColumn="1" w:firstRow="1" w:lastColumn="0" w:lastRow="0" w:noHBand="0" w:noVBand="1" w:val="04A0"/>
+      </w:tblPr>
+      <w:tblGrid>
+        <w:gridCol w:w="9360"/>
+      </w:tblGrid>
+      <w:tr>
+        <w:tc>
+          <w:tcPr>
+            <w:tcW w:type="dxa" w:w="9360"/>
+            <w:shd w:fill="F1F5F9"/>
+          </w:tcPr>
+          <w:p>
+            <w:pPr>
+              <w:spacing w:before="80" w:after="80"/>
+            </w:pPr>
+            <w:r/>
+            <w:r>
+              <w:rPr>
+                <w:rFonts w:ascii="Consolas" w:hAnsi="Consolas"/>
+                <w:color w:val="0F172A"/>
+                <w:sz w:val="17"/>
+              </w:rPr>
+              <w:t>import numpy as np</w:t>
+              <w:br/>
+              <w:t>import pandas as pd</w:t>
+              <w:br/>
+              <w:t>import matplotlib.pyplot as plt</w:t>
+              <w:br/>
+              <w:t>from shiny import App, render, ui, reactive</w:t>
+              <w:br/>
+              <w:br/>
+              <w:t># --- Interfaz de Usuario (UI) ---</w:t>
+              <w:br/>
+              <w:t>app_ui = ui.page_sidebar(</w:t>
+              <w:br/>
+              <w:t xml:space="preserve">    ui.sidebar(</w:t>
+              <w:br/>
+              <w:t xml:space="preserve">        ui.h4('Panel de Control', class_='fw-bold text-primary mb-3'),</w:t>
+              <w:br/>
+              <w:t xml:space="preserve">        ui.input_slider('n_muestras', 'Número de Muestras (N):', min=20, max=500, value=100, step=10),</w:t>
+              <w:br/>
+              <w:t xml:space="preserve">        ui.input_select('tipo_distribucion', 'Tipo de Distribución:',</w:t>
+              <w:br/>
+              <w:t xml:space="preserve">                        {'normal': 'Normal', 'uniforme': 'Uniforme', 'exponencial': 'Exponencial'}),</w:t>
+              <w:br/>
+              <w:t xml:space="preserve">        ui.input_radio_buttons('color_grafica', 'Color de las Barras:',</w:t>
+              <w:br/>
+              <w:t xml:space="preserve">                               {'#2563EB': 'Azul', '#059669': 'Verde', '#DC2626': 'Rojo'}),</w:t>
+              <w:br/>
+              <w:t xml:space="preserve">        width=280,</w:t>
+              <w:br/>
+              <w:t xml:space="preserve">    ),</w:t>
+              <w:br/>
+              <w:t xml:space="preserve">    ui.h3('📊 Dashboard Básico: Generador de Distribuciones', class_='fw-bold mb-3'),</w:t>
+              <w:br/>
+              <w:t xml:space="preserve">    ui.layout_columns(</w:t>
+              <w:br/>
+              <w:t xml:space="preserve">        ui.value_box('Media (x̄)', ui.output_text('kpi_media'), theme='primary'),</w:t>
+              <w:br/>
+              <w:t xml:space="preserve">        ui.value_box('Desv. Est. (σ)', ui.output_text('kpi_desviacion'), theme='success'),</w:t>
+              <w:br/>
+              <w:t xml:space="preserve">        ui.value_box('Total Muestras', ui.output_text('kpi_total'), theme='info'),</w:t>
+              <w:br/>
+              <w:t xml:space="preserve">        col_widths=[4, 4, 4],</w:t>
+              <w:br/>
+              <w:t xml:space="preserve">    ),</w:t>
+              <w:br/>
+              <w:t xml:space="preserve">    ui.layout_columns(</w:t>
+              <w:br/>
+              <w:t xml:space="preserve">        ui.card(ui.card_header('Histograma'), ui.output_plot('grafico_histograma')),</w:t>
+              <w:br/>
+              <w:t xml:space="preserve">        ui.card(ui.card_header('Primeras 10 Observaciones'), ui.output_table('tabla_primeros_datos')),</w:t>
+              <w:br/>
+              <w:t xml:space="preserve">        col_widths=[7, 5],</w:t>
+              <w:br/>
+              <w:t xml:space="preserve">    ),</w:t>
+              <w:br/>
+              <w:t xml:space="preserve">    title='Dashboard Básico - Shiny',</w:t>
+              <w:br/>
+              <w:t>)</w:t>
+              <w:br/>
+              <w:br/>
+              <w:t># --- Lógica del Servidor (Server) ---</w:t>
+              <w:br/>
+              <w:t>def server(input, output, session):</w:t>
+              <w:br/>
+              <w:t xml:space="preserve">    @reactive.calc</w:t>
+              <w:br/>
+              <w:t xml:space="preserve">    def generar_datos():</w:t>
+              <w:br/>
+              <w:t xml:space="preserve">        n = input.n_muestras()</w:t>
+              <w:br/>
+              <w:t xml:space="preserve">        tipo = input.tipo_distribucion()</w:t>
+              <w:br/>
+              <w:t xml:space="preserve">        np.random.seed(42)</w:t>
+              <w:br/>
+              <w:t xml:space="preserve">        if tipo == 'normal': valores = np.random.normal(50, 10, n)</w:t>
+              <w:br/>
+              <w:t xml:space="preserve">        elif tipo == 'uniforme': valores = np.random.uniform(20, 80, n)</w:t>
+              <w:br/>
+              <w:t xml:space="preserve">        else: valores = np.random.exponential(20, n)</w:t>
+              <w:br/>
+              <w:t xml:space="preserve">        return pd.DataFrame({'ID': range(1, n + 1), 'Valor': np.round(valores, 2)})</w:t>
+              <w:br/>
+              <w:br/>
+              <w:t xml:space="preserve">    @render.text</w:t>
+              <w:br/>
+              <w:t xml:space="preserve">    def kpi_media(): return f"{generar_datos()['Valor'].mean():.2f}"</w:t>
+              <w:br/>
+              <w:t xml:space="preserve">    @render.text</w:t>
+              <w:br/>
+              <w:t xml:space="preserve">    def kpi_desviacion(): return f"{generar_datos()['Valor'].std():.2f}"</w:t>
+              <w:br/>
+              <w:t xml:space="preserve">    @render.text</w:t>
+              <w:br/>
+              <w:t xml:space="preserve">    def kpi_total(): return f"{len(generar_datos())} datos"</w:t>
+              <w:br/>
+              <w:br/>
+              <w:t xml:space="preserve">    @render.plot</w:t>
+              <w:br/>
+              <w:t xml:space="preserve">    def grafico_histograma():</w:t>
+              <w:br/>
+              <w:t xml:space="preserve">        df = generar_datos()</w:t>
+              <w:br/>
+              <w:t xml:space="preserve">        fig, ax = plt.subplots(figsize=(6, 4))</w:t>
+              <w:br/>
+              <w:t xml:space="preserve">        ax.hist(df['Valor'], bins=15, color=input.color_grafica(), edgecolor='black')</w:t>
+              <w:br/>
+              <w:t xml:space="preserve">        return fig</w:t>
+              <w:br/>
+              <w:br/>
+              <w:t xml:space="preserve">    @render.table</w:t>
+              <w:br/>
+              <w:t xml:space="preserve">    def tabla_primeros_datos(): return generar_datos().head(10)</w:t>
+              <w:br/>
+              <w:br/>
+              <w:t>app = App(app_ui, server)</w:t>
+              <w:br/>
+              <w:t>if __name__ == '__main__':</w:t>
+              <w:br/>
+              <w:t xml:space="preserve">    app.run(port=8000)</w:t>
+            </w:r>
+          </w:p>
+        </w:tc>
+      </w:tr>
+    </w:tbl>
     <w:p>
-      <w:r>
-        <w:t>El servidor se diseñó bajo el paradigma de Reactividad Pura de Shiny:</w:t>
-        <w:br/>
-        <w:t>1. Decorador @reactive.calc: Crea un cálculo reactivo (datos_filtrados) que re-ejecuta el filtrado en memoria solo cuando cambian los inputs de categoría o precio, evitando cálculos redundantes.</w:t>
-        <w:br/>
-        <w:t>2. Decoradores @render.text: Actualizan las tarjetas métricas con formato de moneda y porcentajes.</w:t>
-        <w:br/>
-        <w:t>3. Decoradores @render.plot: Generan figuras limpias con Seaborn y Matplotlib, adaptándose automáticamente al tamaño de la pantalla.</w:t>
-      </w:r>
+      <w:pPr>
+        <w:spacing w:before="40" w:after="40"/>
+      </w:pPr>
+    </w:p>
+    <w:p>
+      <w:pPr>
+        <w:spacing w:before="120"/>
+      </w:pPr>
     </w:p>
     <w:p>
       <w:pPr>
@@ -748,7 +727,7 @@
       <w:r>
         <w:drawing>
           <wp:inline xmlns:a="http://schemas.openxmlformats.org/drawingml/2006/main" xmlns:pic="http://schemas.openxmlformats.org/drawingml/2006/picture">
-            <wp:extent cx="5760720" cy="2164234"/>
+            <wp:extent cx="5029200" cy="2698773"/>
             <wp:docPr id="2" name="Picture 2"/>
             <wp:cNvGraphicFramePr>
               <a:graphicFrameLocks noChangeAspect="1"/>
@@ -757,7 +736,7 @@
               <a:graphicData uri="http://schemas.openxmlformats.org/drawingml/2006/picture">
                 <pic:pic>
                   <pic:nvPicPr>
-                    <pic:cNvPr id="0" name="graficas_dashboard.png"/>
+                    <pic:cNvPr id="0" name="grafica_histograma.png"/>
                     <pic:cNvPicPr/>
                   </pic:nvPicPr>
                   <pic:blipFill>
@@ -769,7 +748,7 @@
                   <pic:spPr>
                     <a:xfrm>
                       <a:off x="0" y="0"/>
-                      <a:ext cx="5760720" cy="2164234"/>
+                      <a:ext cx="5029200" cy="2698773"/>
                     </a:xfrm>
                     <a:prstGeom prst="rect"/>
                   </pic:spPr>
@@ -785,7 +764,7 @@
         <w:jc w:val="center"/>
       </w:pPr>
       <w:r>
-        <w:t>Figura 2: Visualizaciones estadísticas reactivas generadas dinámicamente por el Dashboard.</w:t>
+        <w:t>Figura 2: Histograma generado de forma reactiva por el Dashboard Básico.</w:t>
       </w:r>
     </w:p>
     <w:p>
@@ -798,29 +777,7 @@
     </w:p>
     <w:p>
       <w:r>
-        <w:t>Para que los servidores en la nube de Posit puedan construir el entorno virtual de la aplicación, es mandatorio colocar un archivo requirements.txt en la raíz del proyecto:</w:t>
-      </w:r>
-    </w:p>
-    <w:p>
-      <w:pPr>
-        <w:spacing w:before="80" w:after="120"/>
-        <w:ind w:left="576"/>
-      </w:pPr>
-      <w:r>
-        <w:rPr>
-          <w:rFonts w:ascii="Consolas" w:hAnsi="Consolas"/>
-          <w:color w:val="1E293B"/>
-          <w:sz w:val="18"/>
-        </w:rPr>
-        <w:t>shiny&gt;=1.0.0</w:t>
-        <w:br/>
-        <w:t>pandas&gt;=2.0.0</w:t>
-        <w:br/>
-        <w:t>numpy&gt;=1.24.0</w:t>
-        <w:br/>
-        <w:t>matplotlib&gt;=3.7.0</w:t>
-        <w:br/>
-        <w:t>seaborn&gt;=0.12.0</w:t>
+        <w:t>Librerías declaradas de forma concisa para el contenedor en la nube:</w:t>
       </w:r>
     </w:p>
     <w:tbl>
@@ -852,13 +809,11 @@
               </w:rPr>
               <w:t>shiny&gt;=1.0.0</w:t>
               <w:br/>
+              <w:t>numpy&gt;=1.24.0</w:t>
+              <w:br/>
               <w:t>pandas&gt;=2.0.0</w:t>
               <w:br/>
-              <w:t>numpy&gt;=1.24.0</w:t>
-              <w:br/>
               <w:t>matplotlib&gt;=3.7.0</w:t>
-              <w:br/>
-              <w:t>seaborn&gt;=0.12.0</w:t>
             </w:r>
           </w:p>
         </w:tc>
@@ -874,31 +829,12 @@
         <w:pStyle w:val="Heading2"/>
       </w:pPr>
       <w:r>
-        <w:t>3.5 Prueba y Ejecución Local</w:t>
+        <w:t>3.5 Ejecución Local</w:t>
       </w:r>
     </w:p>
     <w:p>
       <w:r>
-        <w:t>Para probar el funcionamiento del dashboard en la computadora local antes de subirlo a la nube:</w:t>
-      </w:r>
-    </w:p>
-    <w:p>
-      <w:pPr>
-        <w:spacing w:before="80" w:after="120"/>
-        <w:ind w:left="576"/>
-      </w:pPr>
-      <w:r>
-        <w:rPr>
-          <w:rFonts w:ascii="Consolas" w:hAnsi="Consolas"/>
-          <w:color w:val="1E293B"/>
-          <w:sz w:val="18"/>
-        </w:rPr>
-        <w:t># Ubicarse en el directorio del proyecto y ejecutar:</w:t>
-        <w:br/>
-        <w:t>shiny run --reload --port 8000 app.py</w:t>
-        <w:br/>
-        <w:br/>
-        <w:t># Abrir el navegador en: http://127.0.0.1:8000</w:t>
+        <w:t>Para ejecutar y probar la aplicación en la computadora local:</w:t>
       </w:r>
     </w:p>
     <w:tbl>
@@ -928,12 +864,17 @@
                 <w:color w:val="0F172A"/>
                 <w:sz w:val="17"/>
               </w:rPr>
-              <w:t># Ubicarse en el directorio del proyecto y ejecutar:</w:t>
+              <w:t># Opción 1: Servidor Shiny de recarga automática</w:t>
               <w:br/>
               <w:t>shiny run --reload --port 8000 app.py</w:t>
               <w:br/>
               <w:br/>
-              <w:t># Abrir el navegador en: http://127.0.0.1:8000</w:t>
+              <w:t># Opción 2: Ejecución directa con Python</w:t>
+              <w:br/>
+              <w:t>python app.py</w:t>
+              <w:br/>
+              <w:br/>
+              <w:t># Abrir en el navegador: http://127.0.0.1:8000</w:t>
             </w:r>
           </w:p>
         </w:tc>
@@ -954,20 +895,12 @@
         <w:pStyle w:val="Heading1"/>
       </w:pPr>
       <w:r>
-        <w:t>4. Tramitación de la Cuenta en Posit (shinyapps.io)</w:t>
+        <w:t>4. Tramitación de la Cuenta en Posit y GitHub</w:t>
       </w:r>
     </w:p>
     <w:p>
       <w:r>
-        <w:t>Posit ofrece la plataforma shinyapps.io, el servicio en la nube estándar para alojar aplicaciones Shiny sin necesidad de administrar servidores Linux, certificados SSL o configuraciones complejas de Nginx.</w:t>
-      </w:r>
-    </w:p>
-    <w:p>
-      <w:pPr>
-        <w:pStyle w:val="Heading2"/>
-      </w:pPr>
-      <w:r>
-        <w:t>4.1 Proceso de Registro Paso a Paso</w:t>
+        <w:t>Para poner la aplicación al alcance del público, se tramitó la cuenta oficial en la plataforma en la nube de Posit y se creó el repositorio de código abierto en GitHub.</w:t>
       </w:r>
     </w:p>
     <w:p>
@@ -975,21 +908,17 @@
         <w:rPr>
           <w:b/>
         </w:rPr>
-        <w:t>Paso 1: Acceso al Portal Oficial de Posit</w:t>
+        <w:t>4.1 Cuenta en Posit Connect Cloud</w:t>
         <w:br/>
       </w:r>
       <w:r>
-        <w:t xml:space="preserve">Navegar al sitio web oficial de publicación: </w:t>
-      </w:r>
-      <w:r>
-        <w:rPr>
-          <w:color w:val="1A56DB"/>
-        </w:rPr>
-        <w:t>https://www.shinyapps.io/</w:t>
+        <w:t>• Plataforma: Posit Connect Cloud (servicio oficial gestionado de Posit).</w:t>
         <w:br/>
-      </w:r>
-      <w:r>
-        <w:t>Hacer clic en el botón 'Sign Up' o 'Get Started Free'. El plan gratuito permite alojar hasta 5 aplicaciones activas con 25 horas mensuales de cómputo, ideal para proyectos académicos.</w:t>
+        <w:t>• URL de la cuenta tramitada: https://connect.posit.cloud/rncm11</w:t>
+        <w:br/>
+        <w:t>• Nombre de usuario / Cuenta: rncm11</w:t>
+        <w:br/>
+        <w:t>• Plan utilizado: Gratuito (incluye publicación de aplicaciones Shiny para Python sin costo).</w:t>
       </w:r>
     </w:p>
     <w:p>
@@ -997,154 +926,16 @@
         <w:rPr>
           <w:b/>
         </w:rPr>
-        <w:t>Paso 2: Autenticación</w:t>
+        <w:t>4.2 Repositorio en GitHub</w:t>
         <w:br/>
       </w:r>
       <w:r>
-        <w:t>Completar el registro utilizando una cuenta de Google, GitHub o correo electrónico institucional.</w:t>
-      </w:r>
-    </w:p>
-    <w:p>
-      <w:r>
-        <w:rPr>
-          <w:b/>
-        </w:rPr>
-        <w:t>Paso 3: Definición del Nombre de la Cuenta (Account Name)</w:t>
+        <w:t>• Nombre del repositorio: Shiny-Prog-CD</w:t>
         <w:br/>
-      </w:r>
-      <w:r>
-        <w:t>Durante el asistente inicial, Posit solicitará un 'Account Name' (nombre de usuario único). Este nombre define el subdominio público donde se publicarán tus aplicaciones:</w:t>
+        <w:t>• URL pública: https://github.com/RolandoCastillo11/Shiny-Prog-CD</w:t>
         <w:br/>
-        <w:t xml:space="preserve">  URL Base: https://&lt;tu_cuenta&gt;.shinyapps.io/&lt;nombre_app&gt;/</w:t>
+        <w:t>• Comandos de inicialización y sincronización ejecutados:</w:t>
         <w:br/>
-        <w:t>Ejemplo: Si tu cuenta es 'juan-perez', la URL será https://juan-perez.shinyapps.io/dashboard_basico/</w:t>
-      </w:r>
-    </w:p>
-    <w:p>
-      <w:pPr>
-        <w:pStyle w:val="Heading2"/>
-      </w:pPr>
-      <w:r>
-        <w:t>4.2 Obtención de Tokens y Credenciales de Acceso Seguro</w:t>
-      </w:r>
-    </w:p>
-    <w:p>
-      <w:r>
-        <w:t>Para que tu computadora tenga autorización para subir código a tu cuenta de Posit, se debe generar un Token de acceso:</w:t>
-      </w:r>
-    </w:p>
-    <w:p>
-      <w:r>
-        <w:rPr>
-          <w:i/>
-        </w:rPr>
-        <w:t xml:space="preserve">1. Dentro del panel de administración de shinyapps.io, dirigirse al menú superior derecho y hacer clic en tu usuario o en </w:t>
-      </w:r>
-      <w:r>
-        <w:rPr>
-          <w:b/>
-        </w:rPr>
-        <w:t>Account -&gt; Tokens.</w:t>
-        <w:br/>
-      </w:r>
-      <w:r>
-        <w:rPr>
-          <w:i/>
-        </w:rPr>
-        <w:t xml:space="preserve">2. Hacer clic en el botón verde </w:t>
-      </w:r>
-      <w:r>
-        <w:rPr>
-          <w:b/>
-        </w:rPr>
-        <w:t>+ Add Token.</w:t>
-        <w:br/>
-      </w:r>
-      <w:r>
-        <w:rPr>
-          <w:i/>
-        </w:rPr>
-        <w:t xml:space="preserve">3. En la lista aparecerá el nuevo token. Hacer clic en el botón </w:t>
-      </w:r>
-      <w:r>
-        <w:rPr>
-          <w:b/>
-        </w:rPr>
-        <w:t>Show</w:t>
-      </w:r>
-      <w:r>
-        <w:rPr>
-          <w:i/>
-        </w:rPr>
-        <w:t>.</w:t>
-        <w:br/>
-        <w:t xml:space="preserve">4. Aparecerá una ventana con el secreto (Secret). Hacer clic en </w:t>
-      </w:r>
-      <w:r>
-        <w:rPr>
-          <w:b/>
-        </w:rPr>
-        <w:t xml:space="preserve">Show Secret </w:t>
-      </w:r>
-      <w:r>
-        <w:rPr>
-          <w:i/>
-        </w:rPr>
-        <w:t xml:space="preserve">y luego en </w:t>
-      </w:r>
-      <w:r>
-        <w:rPr>
-          <w:b/>
-        </w:rPr>
-        <w:t>Copy to Clipboard.</w:t>
-      </w:r>
-    </w:p>
-    <w:p>
-      <w:pPr>
-        <w:pStyle w:val="Heading1"/>
-      </w:pPr>
-      <w:r>
-        <w:t>5. Configuración de Credenciales y Publicación en Internet</w:t>
-      </w:r>
-    </w:p>
-    <w:p>
-      <w:r>
-        <w:t>Una vez obtenidas las credenciales desde el panel de Posit, se configuran en el cliente local rsconnect-python.</w:t>
-      </w:r>
-    </w:p>
-    <w:p>
-      <w:pPr>
-        <w:pStyle w:val="Heading2"/>
-      </w:pPr>
-      <w:r>
-        <w:t>5.1 Vinculación de Credenciales en la Terminal</w:t>
-      </w:r>
-    </w:p>
-    <w:p>
-      <w:r>
-        <w:t>Ejecutar el comando de vinculación con la cuenta de Posit configurada (rncm11):</w:t>
-      </w:r>
-    </w:p>
-    <w:p>
-      <w:pPr>
-        <w:spacing w:before="80" w:after="120"/>
-        <w:ind w:left="576"/>
-      </w:pPr>
-      <w:r>
-        <w:rPr>
-          <w:rFonts w:ascii="Consolas" w:hAnsi="Consolas"/>
-          <w:color w:val="1E293B"/>
-          <w:sz w:val="18"/>
-        </w:rPr>
-        <w:t>rsconnect add-set \</w:t>
-        <w:br/>
-        <w:t xml:space="preserve">    --account rncm11 \</w:t>
-        <w:br/>
-        <w:t xml:space="preserve">    --name rncm11 \</w:t>
-        <w:br/>
-        <w:t xml:space="preserve">    --token &lt;TU_TOKEN&gt; \</w:t>
-        <w:br/>
-        <w:t xml:space="preserve">    --secret &lt;TU_SECRET&gt;</w:t>
       </w:r>
     </w:p>
     <w:tbl>
@@ -1174,15 +965,17 @@
                 <w:color w:val="0F172A"/>
                 <w:sz w:val="17"/>
               </w:rPr>
-              <w:t>rsconnect add-set \</w:t>
+              <w:t>git init</w:t>
               <w:br/>
-              <w:t xml:space="preserve">    --account rncm11 \</w:t>
+              <w:t>git add .</w:t>
               <w:br/>
-              <w:t xml:space="preserve">    --name rncm11 \</w:t>
+              <w:t>git commit -m "first commit"</w:t>
               <w:br/>
-              <w:t xml:space="preserve">    --token &lt;TU_TOKEN&gt; \</w:t>
+              <w:t>git branch -M main</w:t>
               <w:br/>
-              <w:t xml:space="preserve">    --secret &lt;TU_SECRET&gt;</w:t>
+              <w:t>git remote add origin https://github.com/RolandoCastillo11/Shiny-Prog-CD.git</w:t>
+              <w:br/>
+              <w:t>git push -u origin main</w:t>
             </w:r>
           </w:p>
         </w:tc>
@@ -1195,118 +988,37 @@
     </w:p>
     <w:p>
       <w:pPr>
-        <w:pStyle w:val="Heading2"/>
+        <w:pStyle w:val="Heading1"/>
       </w:pPr>
       <w:r>
-        <w:t>5.2 Publicación Oficial (Despliegue a la Nube)</w:t>
+        <w:t>5. Publicación del Dashboard en Internet</w:t>
       </w:r>
     </w:p>
     <w:p>
       <w:r>
-        <w:t>Con las credenciales configuradas, el despliegue se efectúa con un solo comando desde la carpeta donde se encuentra la app:</w:t>
-      </w:r>
-    </w:p>
-    <w:p>
-      <w:pPr>
-        <w:spacing w:before="80" w:after="120"/>
-        <w:ind w:left="576"/>
-      </w:pPr>
-      <w:r>
-        <w:rPr>
-          <w:rFonts w:ascii="Consolas" w:hAnsi="Consolas"/>
-          <w:color w:val="1E293B"/>
-          <w:sz w:val="18"/>
-        </w:rPr>
-        <w:t># Navegar a la carpeta del dashboard:</w:t>
-        <w:br/>
-        <w:t>cd "Dashboard_Basico_Shiny"</w:t>
-        <w:br/>
-        <w:br/>
-        <w:t># Desplegar la aplicación a Posit (shinyapps.io / Posit Connect):</w:t>
-        <w:br/>
-        <w:t>rsconnect deploy shiny . \</w:t>
-        <w:br/>
-        <w:t xml:space="preserve">    --name rncm11 \</w:t>
-        <w:br/>
-        <w:t xml:space="preserve">    --title "Dashboard Rendimiento Comercial"</w:t>
-      </w:r>
-    </w:p>
-    <w:tbl>
-      <w:tblPr>
-        <w:tblW w:type="auto" w:w="0"/>
-        <w:jc w:val="center"/>
-        <w:tblLayout w:type="fixed"/>
-        <w:tblLook w:firstColumn="1" w:firstRow="1" w:lastColumn="0" w:lastRow="0" w:noHBand="0" w:noVBand="1" w:val="04A0"/>
-      </w:tblPr>
-      <w:tblGrid>
-        <w:gridCol w:w="9360"/>
-      </w:tblGrid>
-      <w:tr>
-        <w:tc>
-          <w:tcPr>
-            <w:tcW w:type="dxa" w:w="9360"/>
-            <w:shd w:fill="F1F5F9"/>
-          </w:tcPr>
-          <w:p>
-            <w:pPr>
-              <w:spacing w:before="80" w:after="80"/>
-            </w:pPr>
-            <w:r/>
-            <w:r>
-              <w:rPr>
-                <w:rFonts w:ascii="Consolas" w:hAnsi="Consolas"/>
-                <w:color w:val="0F172A"/>
-                <w:sz w:val="17"/>
-              </w:rPr>
-              <w:t># Navegar a la carpeta del dashboard:</w:t>
-              <w:br/>
-              <w:t>cd "Dashboard_Basico_Shiny"</w:t>
-              <w:br/>
-              <w:br/>
-              <w:t># Desplegar la aplicación a Posit (shinyapps.io / Posit Connect):</w:t>
-              <w:br/>
-              <w:t>rsconnect deploy shiny . \</w:t>
-              <w:br/>
-              <w:t xml:space="preserve">    --name rncm11 \</w:t>
-              <w:br/>
-              <w:t xml:space="preserve">    --title "Dashboard Rendimiento Comercial"</w:t>
-            </w:r>
-          </w:p>
-        </w:tc>
-      </w:tr>
-    </w:tbl>
-    <w:p>
-      <w:pPr>
-        <w:spacing w:before="40" w:after="40"/>
-      </w:pPr>
-    </w:p>
-    <w:p>
-      <w:pPr>
-        <w:pStyle w:val="Heading2"/>
-      </w:pPr>
-      <w:r>
-        <w:t>5.3 Proceso Automatizado en los Servidores de Posit</w:t>
+        <w:t>Con el código disponible en GitHub y la cuenta activa en Posit Connect Cloud, el despliegue se realiza directamente desde la interfaz web de Posit:</w:t>
       </w:r>
     </w:p>
     <w:p>
       <w:r>
-        <w:t>Al ejecutar el comando rsconnect deploy shiny, ocurren las siguientes etapas automáticas:</w:t>
+        <w:rPr>
+          <w:b/>
+        </w:rPr>
+        <w:t>Pasos de Publicación en Posit Connect Cloud:</w:t>
         <w:br/>
-        <w:t>1. Empaquetado: Se comprime el código app.py y requirements.txt en un archivo tarball seguro.</w:t>
+      </w:r>
+      <w:r>
+        <w:t>1. Iniciar sesión en https://connect.posit.cloud/rncm11</w:t>
         <w:br/>
-        <w:t>2. Transmisión cifrada: Los archivos se transmiten vía HTTPS al clúster de Posit.</w:t>
+        <w:t>2. Hacer clic en el botón 'Publish' (esquina superior derecha).</w:t>
         <w:br/>
-        <w:t>3. Creación del Contenedor: Posit levanta un contenedor Docker aislado con Linux y Python.</w:t>
+        <w:t>3. Seleccionar la fuente 'GitHub' y vincular la cuenta RolandoCastillo11.</w:t>
         <w:br/>
-        <w:t>4. Instalación de Dependencias: Se descargan y compilan las librerías declaradas en requirements.txt.</w:t>
+        <w:t>4. Elegir el repositorio Shiny-Prog-CD.</w:t>
         <w:br/>
-        <w:t>5. Inicio del Proceso Shiny: Se inicializa el worker de Shiny y se asigna el subdominio público.</w:t>
+        <w:t>5. Posit detecta automáticamente el archivo app.py y el archivo requirements.txt.</w:t>
         <w:br/>
-        <w:t>6. Enlace Público Activo: La terminal arroja la URL definitiva accesible globalmente:</w:t>
-        <w:br/>
-        <w:t xml:space="preserve">   • Posit Connect Cloud: https://connect.posit.cloud/rncm11</w:t>
-        <w:br/>
-        <w:t xml:space="preserve">   • shinyapps.io: https://rncm11.shinyapps.io/dashboard_basico_shiny/</w:t>
+        <w:t>6. Hacer clic en 'Deploy'. Posit construye el contenedor Docker, instala las librerías y activa el enlace web público.</w:t>
       </w:r>
     </w:p>
     <w:p>
@@ -1314,7 +1026,7 @@
         <w:pStyle w:val="Heading1"/>
       </w:pPr>
       <w:r>
-        <w:t>6. Resumen de Actividades y Verificación</w:t>
+        <w:t>6. Resumen de Actividades Realizadas</w:t>
       </w:r>
     </w:p>
     <w:tbl>
@@ -1341,7 +1053,7 @@
                 <w:color w:val="FFFFFF"/>
                 <w:sz w:val="19"/>
               </w:rPr>
-              <w:t>Fase de la Actividad</w:t>
+              <w:t>Actividad</w:t>
             </w:r>
           </w:p>
         </w:tc>
@@ -1357,7 +1069,7 @@
                 <w:color w:val="FFFFFF"/>
                 <w:sz w:val="19"/>
               </w:rPr>
-              <w:t>Herramienta / Archivo</w:t>
+              <w:t>Detalle / Herramienta</w:t>
             </w:r>
           </w:p>
         </w:tc>
@@ -1373,7 +1085,7 @@
                 <w:color w:val="FFFFFF"/>
                 <w:sz w:val="19"/>
               </w:rPr>
-              <w:t>Estado / Resultado</w:t>
+              <w:t>Estado</w:t>
             </w:r>
           </w:p>
         </w:tc>
@@ -1389,7 +1101,7 @@
               <w:rPr>
                 <w:sz w:val="18"/>
               </w:rPr>
-              <w:t>1. Instalación de Shiny</w:t>
+              <w:t>Instalación de Shiny</w:t>
             </w:r>
           </w:p>
         </w:tc>
@@ -1403,7 +1115,7 @@
               <w:rPr>
                 <w:sz w:val="18"/>
               </w:rPr>
-              <w:t>pip install shiny</w:t>
+              <w:t>pip install shiny (v1.8.0)</w:t>
             </w:r>
           </w:p>
         </w:tc>
@@ -1419,7 +1131,7 @@
                 <w:color w:val="059669"/>
                 <w:sz w:val="18"/>
               </w:rPr>
-              <w:t>✓ Completada (v1.8.0)</w:t>
+              <w:t>Completada ✓</w:t>
             </w:r>
           </w:p>
         </w:tc>
@@ -1435,7 +1147,7 @@
               <w:rPr>
                 <w:sz w:val="18"/>
               </w:rPr>
-              <w:t>2. Conector de Posit</w:t>
+              <w:t>Desarrollo del Dashboard</w:t>
             </w:r>
           </w:p>
         </w:tc>
@@ -1449,7 +1161,7 @@
               <w:rPr>
                 <w:sz w:val="18"/>
               </w:rPr>
-              <w:t>pip install rsconnect-python</w:t>
+              <w:t>app.py (Histograma + KPIs + Tabla)</w:t>
             </w:r>
           </w:p>
         </w:tc>
@@ -1465,7 +1177,7 @@
                 <w:color w:val="059669"/>
                 <w:sz w:val="18"/>
               </w:rPr>
-              <w:t>✓ Completada (v1.32.0)</w:t>
+              <w:t>Completado y Probado ✓</w:t>
             </w:r>
           </w:p>
         </w:tc>
@@ -1481,7 +1193,7 @@
               <w:rPr>
                 <w:sz w:val="18"/>
               </w:rPr>
-              <w:t>3. Desarrollo Dashboard</w:t>
+              <w:t>Tramitación en Posit</w:t>
             </w:r>
           </w:p>
         </w:tc>
@@ -1495,7 +1207,7 @@
               <w:rPr>
                 <w:sz w:val="18"/>
               </w:rPr>
-              <w:t>Dashboard_Basico_Shiny/app.py</w:t>
+              <w:t>connect.posit.cloud/rncm11</w:t>
             </w:r>
           </w:p>
         </w:tc>
@@ -1511,7 +1223,7 @@
                 <w:color w:val="059669"/>
                 <w:sz w:val="18"/>
               </w:rPr>
-              <w:t>✓ Completado y Probado</w:t>
+              <w:t>Cuenta Activa ✓</w:t>
             </w:r>
           </w:p>
         </w:tc>
@@ -1527,7 +1239,7 @@
               <w:rPr>
                 <w:sz w:val="18"/>
               </w:rPr>
-              <w:t>4. Tramitación Cuenta</w:t>
+              <w:t>Repositorio GitHub</w:t>
             </w:r>
           </w:p>
         </w:tc>
@@ -1541,14 +1253,14 @@
               <w:rPr>
                 <w:sz w:val="18"/>
               </w:rPr>
-              <w:t>Portal https://shinyapps.io</w:t>
+              <w:t>RolandoCastillo11/Shiny-Prog-CD</w:t>
             </w:r>
           </w:p>
         </w:tc>
         <w:tc>
           <w:tcPr>
             <w:tcW w:type="dxa" w:w="3120"/>
-            <w:shd w:fill="FFFFFF"/>
+            <w:shd w:fill="ECFDF5"/>
           </w:tcPr>
           <w:p>
             <w:r>
@@ -1557,7 +1269,7 @@
                 <w:color w:val="059669"/>
                 <w:sz w:val="18"/>
               </w:rPr>
-              <w:t>✓ Token &amp; Secret Generados</w:t>
+              <w:t>Código Publicado ✓</w:t>
             </w:r>
           </w:p>
         </w:tc>
@@ -1573,7 +1285,7 @@
               <w:rPr>
                 <w:sz w:val="18"/>
               </w:rPr>
-              <w:t>5. Despliegue en la Nube</w:t>
+              <w:t>Documentación Formal</w:t>
             </w:r>
           </w:p>
         </w:tc>
@@ -1587,7 +1299,7 @@
               <w:rPr>
                 <w:sz w:val="18"/>
               </w:rPr>
-              <w:t>rsconnect deploy shiny</w:t>
+              <w:t>Reporte en Word (.docx) y PDF (.pdf)</w:t>
             </w:r>
           </w:p>
         </w:tc>
@@ -1603,7 +1315,7 @@
                 <w:color w:val="059669"/>
                 <w:sz w:val="18"/>
               </w:rPr>
-              <w:t>✓ Listo para Hosting Global</w:t>
+              <w:t>Generado ✓</w:t>
             </w:r>
           </w:p>
         </w:tc>
@@ -1619,18 +1331,18 @@
         <w:pStyle w:val="Heading1"/>
       </w:pPr>
       <w:r>
-        <w:t>7. Conclusiones y Recomendaciones</w:t>
+        <w:t>7. Conclusiones</w:t>
       </w:r>
     </w:p>
     <w:p>
       <w:r>
-        <w:t>1. Shiny for Python representa una de las herramientas más maduras para la divulgación de ciencia de datos, permitiendo pasar de prototipos analíticos en Jupyter Notebook a aplicaciones web de nivel productivo sin requerir conocimientos avanzados de desarrollo web frontend (HTML/CSS/JavaScript puro).</w:t>
+        <w:t>1. Shiny for Python permite construir herramientas analíticas interactivas con una curva de aprendizaje mínima, utilizando estructuras limpias que separan la interfaz de usuario (UI) de la lógica del servidor (Server).</w:t>
         <w:br/>
         <w:br/>
-        <w:t>2. La integración de rsconnect-python con Posit shinyapps.io democratiza la publicación científica y empresarial, proporcionando un flujo de despliegue continuo (CI/CD) simplificado a una sola línea de comando.</w:t>
+        <w:t>2. La reactividad mediante decoradores (@reactive.calc y @render) simplifica enormemente la sincronización entre los controles visuales y los cálculos numéricos en tiempo real.</w:t>
         <w:br/>
         <w:br/>
-        <w:t>3. La reactividad granular de Shiny asegura un rendimiento óptimo de cómputo en servidores remotos, recalculando únicamente los nodos del grafo de dependencias que se ven afectados por la interacción del usuario.</w:t>
+        <w:t>3. La combinación de GitHub con Posit Connect Cloud ofrece un flujo de despliegue continuo (CI/CD) ágil, permitiendo que cualquier estudiante o profesional comparta sus tableros de ciencia de datos con el mundo sin necesidad de gestionar servidores físicos ni configuraciones complejas.</w:t>
       </w:r>
     </w:p>
     <w:sectPr>
@@ -2073,7 +1785,7 @@
       <w:rFonts w:asciiTheme="majorHAnsi" w:eastAsiaTheme="majorEastAsia" w:hAnsiTheme="majorHAnsi" w:cstheme="majorBidi"/>
       <w:b/>
       <w:bCs/>
-      <w:color w:val="1A56DB"/>
+      <w:color w:val="1E40AF"/>
       <w:sz w:val="28"/>
       <w:szCs w:val="28"/>
     </w:rPr>

</xml_diff>

<commit_message>
Fix: Reemplazar output_table por output_data_frame y agregar jinja2 en requirements
</commit_message>
<xml_diff>
--- a/Reporte_Instalacion_Shiny_y_Despliegue_Posit.docx
+++ b/Reporte_Instalacion_Shiny_y_Despliegue_Posit.docx
@@ -635,7 +635,7 @@
               <w:br/>
               <w:t xml:space="preserve">        ui.card(ui.card_header('Histograma'), ui.output_plot('grafico_histograma')),</w:t>
               <w:br/>
-              <w:t xml:space="preserve">        ui.card(ui.card_header('Primeras 10 Observaciones'), ui.output_table('tabla_primeros_datos')),</w:t>
+              <w:t xml:space="preserve">        ui.card(ui.card_header('Primeras 10 Observaciones'), ui.output_data_frame('tabla_primeros_datos')),</w:t>
               <w:br/>
               <w:t xml:space="preserve">        col_widths=[7, 5],</w:t>
               <w:br/>
@@ -695,9 +695,9 @@
               <w:t xml:space="preserve">        return fig</w:t>
               <w:br/>
               <w:br/>
-              <w:t xml:space="preserve">    @render.table</w:t>
+              <w:t xml:space="preserve">    @render.data_frame</w:t>
               <w:br/>
-              <w:t xml:space="preserve">    def tabla_primeros_datos(): return generar_datos().head(10)</w:t>
+              <w:t xml:space="preserve">    def tabla_primeros_datos(): return render.DataGrid(generar_datos().head(10))</w:t>
               <w:br/>
               <w:br/>
               <w:t>app = App(app_ui, server)</w:t>

</xml_diff>

<commit_message>
Docs: Reporte detallado desde instalacion de Shiny hasta inicializacion local y despliegue en Posit
</commit_message>
<xml_diff>
--- a/Reporte_Instalacion_Shiny_y_Despliegue_Posit.docx
+++ b/Reporte_Instalacion_Shiny_y_Despliegue_Posit.docx
@@ -20,7 +20,7 @@
     </w:p>
     <w:p>
       <w:pPr>
-        <w:spacing w:before="360" w:after="240"/>
+        <w:spacing w:before="320" w:after="240"/>
         <w:jc w:val="center"/>
       </w:pPr>
       <w:r>
@@ -28,9 +28,9 @@
           <w:rFonts w:ascii="Calibri" w:hAnsi="Calibri"/>
           <w:b/>
           <w:color w:val="1E40AF"/>
-          <w:sz w:val="40"/>
+          <w:sz w:val="38"/>
         </w:rPr>
-        <w:t>INSTALACIÓN DE SHINY, DESARROLLO DE UN DASHBOARD BÁSICO Y PUBLICACIÓN EN LA NUBE (POSIT)</w:t>
+        <w:t>GUÍA INTEGRAL DE INSTALACIÓN DE SHINY, CONSTRUCCIÓN DE UN DASHBOARD BÁSICO Y PUBLICACIÓN EN POSIT CONNECT CLOUD</w:t>
       </w:r>
     </w:p>
     <w:p>
@@ -44,7 +44,7 @@
           <w:color w:val="64748B"/>
           <w:sz w:val="22"/>
         </w:rPr>
-        <w:t>Guía Paso a Paso de Instalación, Código Fuente del Dashboard y Despliegue en Posit Connect Cloud</w:t>
+        <w:t>Proceso Paso a Paso: Desde la Instalación del Entorno hasta la Inicialización y Despliegue en la Nube</w:t>
       </w:r>
     </w:p>
     <w:p>
@@ -88,7 +88,7 @@
               <w:rPr>
                 <w:sz w:val="19"/>
               </w:rPr>
-              <w:t>Instalación de Shiny, Dashboard Básico y Publicación en Internet</w:t>
+              <w:t>Instalación de Shiny, Dashboard Básico y Despliegue en Posit</w:t>
             </w:r>
           </w:p>
         </w:tc>
@@ -105,7 +105,7 @@
                 <w:b/>
                 <w:sz w:val="19"/>
               </w:rPr>
-              <w:t>Usuario / Cuenta Posit:</w:t>
+              <w:t>Cuenta Posit Connect Cloud:</w:t>
             </w:r>
           </w:p>
         </w:tc>
@@ -136,7 +136,7 @@
                 <w:b/>
                 <w:sz w:val="19"/>
               </w:rPr>
-              <w:t>Repositorio GitHub:</w:t>
+              <w:t>Repositorio Oficial GitHub:</w:t>
             </w:r>
           </w:p>
         </w:tc>
@@ -167,7 +167,7 @@
                 <w:b/>
                 <w:sz w:val="19"/>
               </w:rPr>
-              <w:t>Herramientas Utilizadas:</w:t>
+              <w:t>Herramientas Principales:</w:t>
             </w:r>
           </w:p>
         </w:tc>
@@ -198,7 +198,7 @@
                 <w:b/>
                 <w:sz w:val="19"/>
               </w:rPr>
-              <w:t>Fecha de Realización:</w:t>
+              <w:t>Fecha:</w:t>
             </w:r>
           </w:p>
         </w:tc>
@@ -228,12 +228,27 @@
         <w:pStyle w:val="Heading1"/>
       </w:pPr>
       <w:r>
-        <w:t>1. Introducción y Objetivos</w:t>
+        <w:t>1. Introducción y Requisitos Previos</w:t>
       </w:r>
     </w:p>
     <w:p>
       <w:r>
-        <w:t>El propósito fundamental de esta actividad es familiarizarse con el framework Shiny for Python, aprender a estructurar un tablero analítico básico e interactivo, tramitar una cuenta en la infraestructura en la nube de Posit y desplegar la aplicación para que sea accesible públicamente a través de internet.</w:t>
+        <w:t>En la Ciencia de Datos, la comunicación de resultados es tan importante como el análisis estadístico o el entrenamiento de modelos. Tradicionalmente, crear una aplicación web interactiva requería programar tanto el frontend (HTML, CSS, JavaScript) como el backend (servidores Flask, Django o FastAPI). Shiny for Python simplifica este proceso radicalmente, permitiendo crear tableros interactivos completos programando exclusivamente en Python mediante un modelo reactivo.</w:t>
+      </w:r>
+    </w:p>
+    <w:p>
+      <w:r>
+        <w:t>Requisitos Previos del Sistema:</w:t>
+        <w:br/>
+        <w:t>• Python 3.10 o superior (en esta práctica se utilizó Python 3.11.0).</w:t>
+        <w:br/>
+        <w:t>• Gestor de paquetes pip actualizado.</w:t>
+        <w:br/>
+        <w:t>• Terminal o consola del sistema operativo (PowerShell o CMD en Windows).</w:t>
+        <w:br/>
+        <w:t>• Cuenta activa en GitHub para control de versiones.</w:t>
+        <w:br/>
+        <w:t>• Cuenta gratuita en Posit Connect Cloud para el hosting en internet.</w:t>
       </w:r>
     </w:p>
     <w:p>
@@ -241,27 +256,27 @@
         <w:rPr>
           <w:b/>
         </w:rPr>
-        <w:t>Objetivos Específicos:</w:t>
+        <w:t>Objetivos de la Práctica:</w:t>
         <w:br/>
       </w:r>
       <w:r>
-        <w:t>1. Instalar Shiny for Python y sus dependencias en el entorno local de desarrollo.</w:t>
+        <w:t>1. Instalar Shiny for Python y todas sus dependencias necesarias en la máquina local.</w:t>
         <w:br/>
       </w:r>
       <w:r>
-        <w:t>2. Crear un Dashboard Básico que demuestre la reactividad de Shiny mediante entradas, tarjetas estadísticas (Value Boxes), un gráfico interactivo y una tabla de datos.</w:t>
+        <w:t>2. Crear la estructura del proyecto y desarrollar un Dashboard Básico que demuestre entradas interactivas, KPIs y visualización gráfica reactiva.</w:t>
         <w:br/>
       </w:r>
       <w:r>
-        <w:t>3. Tramitar y configurar la cuenta de publicación en Posit Connect Cloud (cuenta: rncm11).</w:t>
+        <w:t>3. Explicar los métodos de inicialización y ejecución local de la aplicación en el navegador web.</w:t>
         <w:br/>
       </w:r>
       <w:r>
-        <w:t>4. Crear y sincronizar el repositorio en GitHub (RolandoCastillo11/Shiny-Prog-CD).</w:t>
+        <w:t>4. Tramitar la cuenta en Posit Connect Cloud (cuenta: rncm11) y vincular el repositorio en GitHub.</w:t>
         <w:br/>
       </w:r>
       <w:r>
-        <w:t>5. Publicar el dashboard en internet y documentar los resultados.</w:t>
+        <w:t>5. Desplegar el dashboard en internet de forma pública y accesible globalmente.</w:t>
       </w:r>
     </w:p>
     <w:p>
@@ -276,7 +291,7 @@
       <w:r>
         <w:drawing>
           <wp:inline xmlns:a="http://schemas.openxmlformats.org/drawingml/2006/main" xmlns:pic="http://schemas.openxmlformats.org/drawingml/2006/picture">
-            <wp:extent cx="5852160" cy="1298179"/>
+            <wp:extent cx="5852160" cy="1294850"/>
             <wp:docPr id="1" name="Picture 1"/>
             <wp:cNvGraphicFramePr>
               <a:graphicFrameLocks noChangeAspect="1"/>
@@ -297,7 +312,7 @@
                   <pic:spPr>
                     <a:xfrm>
                       <a:off x="0" y="0"/>
-                      <a:ext cx="5852160" cy="1298179"/>
+                      <a:ext cx="5852160" cy="1294850"/>
                     </a:xfrm>
                     <a:prstGeom prst="rect"/>
                   </pic:spPr>
@@ -313,7 +328,7 @@
         <w:jc w:val="center"/>
       </w:pPr>
       <w:r>
-        <w:t>Figura 1: Fases secuenciales de la actividad práctica.</w:t>
+        <w:t>Figura 1: Diagrama secuencial de las 5 fases desarrolladas en la práctica.</w:t>
       </w:r>
     </w:p>
     <w:p>
@@ -321,12 +336,12 @@
         <w:pStyle w:val="Heading1"/>
       </w:pPr>
       <w:r>
-        <w:t>2. Pasos para la Instalación de Shiny</w:t>
+        <w:t>2. Paso a Paso: Instalación de Shiny y Dependencias</w:t>
       </w:r>
     </w:p>
     <w:p>
       <w:r>
-        <w:t>Shiny for Python es el paquete oficial desarrollado por Posit para construir aplicaciones web reactivas en Python. La instalación se realiza a través de la terminal o consola de comandos (PowerShell / CMD) mediante pip:</w:t>
+        <w:t>La instalación de Shiny y su entorno se llevó a cabo desde la consola Windows PowerShell. A continuación se detallan los comandos ejecutados y su función técnica:</w:t>
       </w:r>
     </w:p>
     <w:p>
@@ -334,8 +349,11 @@
         <w:rPr>
           <w:b/>
         </w:rPr>
-        <w:t>Paso 2.1: Instalación de Shiny y librerías analíticas básicas</w:t>
+        <w:t>Paso 2.1: Verificación de la versión de Python instalada</w:t>
         <w:br/>
+      </w:r>
+      <w:r>
+        <w:t>Antes de instalar cualquier librería, es fundamental confirmar que Python está accesible en la variable PATH del sistema:</w:t>
       </w:r>
     </w:p>
     <w:tbl>
@@ -365,7 +383,9 @@
                 <w:color w:val="0F172A"/>
                 <w:sz w:val="17"/>
               </w:rPr>
-              <w:t>pip install shiny numpy pandas matplotlib rsconnect-python</w:t>
+              <w:t>python --version</w:t>
+              <w:br/>
+              <w:t># Salida: Python 3.11.0</w:t>
             </w:r>
           </w:p>
         </w:tc>
@@ -381,11 +401,124 @@
         <w:rPr>
           <w:b/>
         </w:rPr>
-        <w:t>Paso 2.2: Comprobación de la instalación</w:t>
+        <w:t>Paso 2.2: Instalación de Shiny for Python</w:t>
         <w:br/>
       </w:r>
       <w:r>
-        <w:t>Para confirmar que Shiny se instaló correctamente y conocer la versión instalada, se ejecuta:</w:t>
+        <w:t>Shiny se instala mediante el gestor oficial pip. Al ejecutar esta instrucción, pip descarga tanto Shiny como sus motores internos: Uvicorn (servidor ASGI asíncrono para Python), Starlette (framework base de enrutamiento web), HTMLTools (generador de etiquetas HTML) y BSLib (estilos visuales modernos basados en Bootstrap):</w:t>
+      </w:r>
+    </w:p>
+    <w:tbl>
+      <w:tblPr>
+        <w:tblW w:type="auto" w:w="0"/>
+        <w:jc w:val="center"/>
+        <w:tblLayout w:type="fixed"/>
+        <w:tblLook w:firstColumn="1" w:firstRow="1" w:lastColumn="0" w:lastRow="0" w:noHBand="0" w:noVBand="1" w:val="04A0"/>
+      </w:tblPr>
+      <w:tblGrid>
+        <w:gridCol w:w="9360"/>
+      </w:tblGrid>
+      <w:tr>
+        <w:tc>
+          <w:tcPr>
+            <w:tcW w:type="dxa" w:w="9360"/>
+            <w:shd w:fill="F1F5F9"/>
+          </w:tcPr>
+          <w:p>
+            <w:pPr>
+              <w:spacing w:before="80" w:after="80"/>
+            </w:pPr>
+            <w:r/>
+            <w:r>
+              <w:rPr>
+                <w:rFonts w:ascii="Consolas" w:hAnsi="Consolas"/>
+                <w:color w:val="0F172A"/>
+                <w:sz w:val="17"/>
+              </w:rPr>
+              <w:t>pip install shiny</w:t>
+            </w:r>
+          </w:p>
+        </w:tc>
+      </w:tr>
+    </w:tbl>
+    <w:p>
+      <w:pPr>
+        <w:spacing w:before="40" w:after="40"/>
+      </w:pPr>
+    </w:p>
+    <w:p>
+      <w:r>
+        <w:rPr>
+          <w:b/>
+        </w:rPr>
+        <w:t>Paso 2.3: Instalación de librerías analíticas y del conector de Posit</w:t>
+        <w:br/>
+      </w:r>
+      <w:r>
+        <w:t>Para dotar al dashboard de capacidades de generación de datos, cálculo matricial y gráficos estadísticos, así como la herramienta de publicación en la nube, se instalaron los paquetes complementarios:</w:t>
+      </w:r>
+    </w:p>
+    <w:tbl>
+      <w:tblPr>
+        <w:tblW w:type="auto" w:w="0"/>
+        <w:jc w:val="center"/>
+        <w:tblLayout w:type="fixed"/>
+        <w:tblLook w:firstColumn="1" w:firstRow="1" w:lastColumn="0" w:lastRow="0" w:noHBand="0" w:noVBand="1" w:val="04A0"/>
+      </w:tblPr>
+      <w:tblGrid>
+        <w:gridCol w:w="9360"/>
+      </w:tblGrid>
+      <w:tr>
+        <w:tc>
+          <w:tcPr>
+            <w:tcW w:type="dxa" w:w="9360"/>
+            <w:shd w:fill="F1F5F9"/>
+          </w:tcPr>
+          <w:p>
+            <w:pPr>
+              <w:spacing w:before="80" w:after="80"/>
+            </w:pPr>
+            <w:r/>
+            <w:r>
+              <w:rPr>
+                <w:rFonts w:ascii="Consolas" w:hAnsi="Consolas"/>
+                <w:color w:val="0F172A"/>
+                <w:sz w:val="17"/>
+              </w:rPr>
+              <w:t>pip install numpy pandas matplotlib jinja2 rsconnect-python</w:t>
+              <w:br/>
+              <w:br/>
+              <w:t># Función de cada librería:</w:t>
+              <w:br/>
+              <w:t># - numpy: Generación de distribuciones aleatorias (Normal, Uniforme, Exponencial)</w:t>
+              <w:br/>
+              <w:t># - pandas: Manejo tabular de los datos y creación del DataFrame</w:t>
+              <w:br/>
+              <w:t># - matplotlib: Renderizado del histograma de frecuencias</w:t>
+              <w:br/>
+              <w:t># - jinja2: Motor de plantillas HTML requerido para formateo tabular seguro</w:t>
+              <w:br/>
+              <w:t># - rsconnect-python: Herramienta CLI oficial de Posit para despliegue en la nube</w:t>
+            </w:r>
+          </w:p>
+        </w:tc>
+      </w:tr>
+    </w:tbl>
+    <w:p>
+      <w:pPr>
+        <w:spacing w:before="40" w:after="40"/>
+      </w:pPr>
+    </w:p>
+    <w:p>
+      <w:r>
+        <w:rPr>
+          <w:b/>
+        </w:rPr>
+        <w:t>Paso 2.4: Comprobación y verificación de la instalación</w:t>
+        <w:br/>
+      </w:r>
+      <w:r>
+        <w:t>Se verificó en terminal la correcta instalación y la versión disponible del CLI de Shiny:</w:t>
       </w:r>
     </w:p>
     <w:tbl>
@@ -417,12 +550,12 @@
               </w:rPr>
               <w:t>shiny --version</w:t>
               <w:br/>
-              <w:t># Resultado en consola: shiny, version 1.8.0</w:t>
+              <w:t># Salida esperada: shiny, version 1.8.0</w:t>
               <w:br/>
               <w:br/>
-              <w:t>python --version</w:t>
+              <w:t>rsconnect version</w:t>
               <w:br/>
-              <w:t># Resultado: Python 3.11.0</w:t>
+              <w:t># Salida esperada: 1.32.0</w:t>
             </w:r>
           </w:p>
         </w:tc>
@@ -438,20 +571,81 @@
         <w:pStyle w:val="Heading1"/>
       </w:pPr>
       <w:r>
-        <w:t>3. Desarrollo del Dashboard Básico</w:t>
+        <w:t>3. Preparación del Directorio y Estructura del Proyecto</w:t>
       </w:r>
     </w:p>
     <w:p>
       <w:r>
-        <w:t>Siguiendo el requerimiento de crear un dashboard básico, claro y sin sobrecargas, se implementó una aplicación que permite explorar distribuciones estadísticas en tiempo real: 'Generador de Distribuciones Estadísticas'.</w:t>
+        <w:t>Para mantener el código organizado de forma modular, se creó un directorio dedicado para la aplicación: Dashboard_Basico_Shiny.</w:t>
       </w:r>
     </w:p>
     <w:p>
+      <w:r>
+        <w:rPr>
+          <w:b/>
+        </w:rPr>
+        <w:t>Paso 3.1: Creación de la carpeta y navegación a la ruta de trabajo</w:t>
+        <w:br/>
+      </w:r>
+      <w:r>
+        <w:t>En la consola de comandos se ejecutó:</w:t>
+      </w:r>
+    </w:p>
+    <w:tbl>
+      <w:tblPr>
+        <w:tblW w:type="auto" w:w="0"/>
+        <w:jc w:val="center"/>
+        <w:tblLayout w:type="fixed"/>
+        <w:tblLook w:firstColumn="1" w:firstRow="1" w:lastColumn="0" w:lastRow="0" w:noHBand="0" w:noVBand="1" w:val="04A0"/>
+      </w:tblPr>
+      <w:tblGrid>
+        <w:gridCol w:w="9360"/>
+      </w:tblGrid>
+      <w:tr>
+        <w:tc>
+          <w:tcPr>
+            <w:tcW w:type="dxa" w:w="9360"/>
+            <w:shd w:fill="F1F5F9"/>
+          </w:tcPr>
+          <w:p>
+            <w:pPr>
+              <w:spacing w:before="80" w:after="80"/>
+            </w:pPr>
+            <w:r/>
+            <w:r>
+              <w:rPr>
+                <w:rFonts w:ascii="Consolas" w:hAnsi="Consolas"/>
+                <w:color w:val="0F172A"/>
+                <w:sz w:val="17"/>
+              </w:rPr>
+              <w:t># Crear la carpeta del proyecto</w:t>
+              <w:br/>
+              <w:t>mkdir Dashboard_Basico_Shiny</w:t>
+              <w:br/>
+              <w:br/>
+              <w:t># Ubicarse DENTRO de la carpeta (Paso crucial para evitar errores de 'app.py not found')</w:t>
+              <w:br/>
+              <w:t>cd Dashboard_Basico_Shiny</w:t>
+            </w:r>
+          </w:p>
+        </w:tc>
+      </w:tr>
+    </w:tbl>
+    <w:p>
       <w:pPr>
-        <w:pStyle w:val="Heading2"/>
+        <w:spacing w:before="40" w:after="40"/>
       </w:pPr>
+    </w:p>
+    <w:p>
       <w:r>
-        <w:t>3.1 Estructura de Archivos del Proyecto</w:t>
+        <w:rPr>
+          <w:b/>
+        </w:rPr>
+        <w:t>Paso 3.2: Estructura de archivos del proyecto</w:t>
+        <w:br/>
+      </w:r>
+      <w:r>
+        <w:t>Dentro de la carpeta se establecieron los archivos mínimos necesarios:</w:t>
       </w:r>
     </w:p>
     <w:tbl>
@@ -483,15 +677,15 @@
               </w:rPr>
               <w:t>Dashboard_Basico_Shiny/</w:t>
               <w:br/>
-              <w:t>├── app.py             # Código fuente de la aplicación básica (UI + Server)</w:t>
+              <w:t>├── app.py             # Código fuente interactivo completo (UI + Server)</w:t>
               <w:br/>
-              <w:t>├── requirements.txt   # Librerías mínimas necesarias para Posit (shiny, numpy, pandas, matplotlib)</w:t>
+              <w:t>├── requirements.txt   # Lista de librerías para que Posit instale en la nube</w:t>
               <w:br/>
-              <w:t>├── README.md          # Documentación del proyecto en GitHub</w:t>
+              <w:t>├── .gitignore         # Exclusión de archivos temporales (__pycache__, .venv)</w:t>
               <w:br/>
-              <w:t>├── .gitignore         # Archivos excluidos del control de versiones</w:t>
+              <w:t>├── manifest.json      # Manifiesto de compilación generado por rsconnect</w:t>
               <w:br/>
-              <w:t>└── manifest.json      # Manifiesto de compilación generado por rsconnect</w:t>
+              <w:t>└── README.md          # Documentación del proyecto para GitHub</w:t>
             </w:r>
           </w:p>
         </w:tc>
@@ -504,10 +698,23 @@
     </w:p>
     <w:p>
       <w:pPr>
+        <w:pStyle w:val="Heading1"/>
+      </w:pPr>
+      <w:r>
+        <w:t>4. Desarrollo y Explicación del Código del Dashboard Básico</w:t>
+      </w:r>
+    </w:p>
+    <w:p>
+      <w:r>
+        <w:t>Siguiendo el objetivo de construir un dashboard básico, claro y sin sobrecargas, se desarrolló el 'Generador de Distribuciones Estadísticas' en app.py. Este ejemplo permite comprender a fondo los tres pilares de una aplicación Shiny: la Interfaz de Usuario (UI), la Lógica del Servidor (Server) y la Inicialización.</w:t>
+      </w:r>
+    </w:p>
+    <w:p>
+      <w:pPr>
         <w:pStyle w:val="Heading2"/>
       </w:pPr>
       <w:r>
-        <w:t>3.2 Componentes del Dashboard Básico</w:t>
+        <w:t>4.1 Explicación de la Interfaz de Usuario (UI - app_ui)</w:t>
       </w:r>
     </w:p>
     <w:p>
@@ -515,40 +722,54 @@
         <w:rPr>
           <w:b/>
         </w:rPr>
-        <w:t xml:space="preserve">• Controles de Entrada (Sidebar): </w:t>
+        <w:t xml:space="preserve">• ui.page_sidebar: </w:t>
       </w:r>
       <w:r>
-        <w:t>Un control deslizante (slider) para elegir el número de muestras N (de 20 a 500), un selector desplegable para elegir la distribución (Normal, Uniforme o Exponencial) y botones de opción para personalizar el color del gráfico.</w:t>
+        <w:t>Genera una distribución moderna con una barra lateral izquierda de controles y un panel principal derecho.</w:t>
         <w:br/>
       </w:r>
       <w:r>
         <w:rPr>
           <w:b/>
         </w:rPr>
-        <w:t xml:space="preserve">• Tarjetas de Indicadores (Value Boxes): </w:t>
+        <w:t>• Controles de Entrada (Inputs):</w:t>
+        <w:br/>
       </w:r>
       <w:r>
-        <w:t>Tres tarjetas numéricas que calculan dinámicamente la Media Aritmética (x̄), la Desviación Estándar (σ) y el Total de observaciones.</w:t>
+        <w:t xml:space="preserve">  - ui.input_slider('n_muestras', ...): Deslizador que define cuántos números aleatorios generar (20 a 500).</w:t>
+        <w:br/>
+      </w:r>
+      <w:r>
+        <w:t xml:space="preserve">  - ui.input_select('tipo_distribucion', ...): Menú desplegable para alternar entre Normal, Uniforme y Exponencial.</w:t>
+        <w:br/>
+      </w:r>
+      <w:r>
+        <w:t xml:space="preserve">  - ui.input_radio_buttons('color_grafica', ...): Botones de selección única para cambiar el color del histograma.</w:t>
         <w:br/>
       </w:r>
       <w:r>
         <w:rPr>
           <w:b/>
         </w:rPr>
-        <w:t xml:space="preserve">• Gráfico Interactivo (Histograma): </w:t>
+        <w:t xml:space="preserve">• Tarjetas de Indicadores (ui.value_box): </w:t>
       </w:r>
       <w:r>
-        <w:t>Muestra la distribución de frecuencias generada con Matplotlib, actualizándose al instante ante cualquier cambio del usuario.</w:t>
+        <w:t>Muestran de forma visual y destacada tres KPIs en tiempo real: Media Aritmética (x̄), Desviación Estándar (σ) y Total de Muestras.</w:t>
         <w:br/>
       </w:r>
       <w:r>
         <w:rPr>
           <w:b/>
         </w:rPr>
-        <w:t xml:space="preserve">• Tabla de Datos: </w:t>
+        <w:t>• Contenedores de Salida (Outputs):</w:t>
+        <w:br/>
       </w:r>
       <w:r>
-        <w:t>Una tabla limpia que presenta las primeras 10 observaciones generadas.</w:t>
+        <w:t xml:space="preserve">  - ui.output_plot('grafico_histograma'): Espacio donde se dibuja el gráfico generado con Matplotlib.</w:t>
+        <w:br/>
+      </w:r>
+      <w:r>
+        <w:t xml:space="preserve">  - ui.output_data_frame('tabla_primeros_datos'): Contenedor donde se despliegan las primeras 10 filas del conjunto de datos generado.</w:t>
       </w:r>
     </w:p>
     <w:p>
@@ -556,7 +777,85 @@
         <w:pStyle w:val="Heading2"/>
       </w:pPr>
       <w:r>
-        <w:t>3.3 Código Fuente Completo de app.py</w:t>
+        <w:t>4.2 Explicación de la Lógica del Servidor (Server)</w:t>
+      </w:r>
+    </w:p>
+    <w:p>
+      <w:r>
+        <w:t>El servidor contiene las funciones reactivas que responden a la interacción del usuario:</w:t>
+        <w:br/>
+        <w:t>1. Decorador @reactive.calc (Función generar_datos): Este cálculo reactivo genera el conjunto de datos con NumPy y Pandas. Shiny almacena el resultado en memoria caché y solo vuelve a calcularlo si el usuario mueve el slider o cambia de distribución, evitando procesamiento innecesario.</w:t>
+        <w:br/>
+        <w:t>2. Decoradores @render.text (kpi_media, kpi_desviacion, kpi_total): Extraen las métricas estadísticas del cálculo reactivo y las envían a los Value Boxes correspondientes.</w:t>
+        <w:br/>
+        <w:t>3. Decorador @render.plot (grafico_histograma): Genera la figura de Matplotlib dibujando las barras del histograma con el color seleccionado por el usuario.</w:t>
+        <w:br/>
+        <w:t>4. Decorador @render.data_frame (tabla_primeros_datos): Convierte el DataFrame de Pandas en un DataGrid interactivo de Shiny sin dependencias externas complejas.</w:t>
+      </w:r>
+    </w:p>
+    <w:p>
+      <w:pPr>
+        <w:spacing w:before="120"/>
+      </w:pPr>
+    </w:p>
+    <w:p>
+      <w:pPr>
+        <w:jc w:val="center"/>
+      </w:pPr>
+      <w:r>
+        <w:drawing>
+          <wp:inline xmlns:a="http://schemas.openxmlformats.org/drawingml/2006/main" xmlns:pic="http://schemas.openxmlformats.org/drawingml/2006/picture">
+            <wp:extent cx="5120640" cy="2560320"/>
+            <wp:docPr id="2" name="Picture 2"/>
+            <wp:cNvGraphicFramePr>
+              <a:graphicFrameLocks noChangeAspect="1"/>
+            </wp:cNvGraphicFramePr>
+            <a:graphic>
+              <a:graphicData uri="http://schemas.openxmlformats.org/drawingml/2006/picture">
+                <pic:pic>
+                  <pic:nvPicPr>
+                    <pic:cNvPr id="0" name="grafica_histograma.png"/>
+                    <pic:cNvPicPr/>
+                  </pic:nvPicPr>
+                  <pic:blipFill>
+                    <a:blip r:embed="rId10"/>
+                    <a:stretch>
+                      <a:fillRect/>
+                    </a:stretch>
+                  </pic:blipFill>
+                  <pic:spPr>
+                    <a:xfrm>
+                      <a:off x="0" y="0"/>
+                      <a:ext cx="5120640" cy="2560320"/>
+                    </a:xfrm>
+                    <a:prstGeom prst="rect"/>
+                  </pic:spPr>
+                </pic:pic>
+              </a:graphicData>
+            </a:graphic>
+          </wp:inline>
+        </w:drawing>
+      </w:r>
+    </w:p>
+    <w:p>
+      <w:pPr>
+        <w:jc w:val="center"/>
+      </w:pPr>
+      <w:r>
+        <w:t>Figura 2: Histograma de frecuencias y líneas estadísticas generado por el Dashboard Básico.</w:t>
+      </w:r>
+    </w:p>
+    <w:p>
+      <w:pPr>
+        <w:pStyle w:val="Heading2"/>
+      </w:pPr>
+      <w:r>
+        <w:t>4.3 Código Fuente Completo de app.py</w:t>
+      </w:r>
+    </w:p>
+    <w:p>
+      <w:r>
+        <w:t>A continuación se muestra el código completo implementado en el archivo app.py:</w:t>
       </w:r>
     </w:p>
     <w:tbl>
@@ -595,7 +894,11 @@
               <w:t>from shiny import App, render, ui, reactive</w:t>
               <w:br/>
               <w:br/>
-              <w:t># --- Interfaz de Usuario (UI) ---</w:t>
+              <w:t># -----------------------------------------------------------------------------</w:t>
+              <w:br/>
+              <w:t># 1. Interfaz de Usuario (UI)</w:t>
+              <w:br/>
+              <w:t># -----------------------------------------------------------------------------</w:t>
               <w:br/>
               <w:t>app_ui = ui.page_sidebar(</w:t>
               <w:br/>
@@ -607,25 +910,29 @@
               <w:br/>
               <w:t xml:space="preserve">        ui.input_select('tipo_distribucion', 'Tipo de Distribución:',</w:t>
               <w:br/>
-              <w:t xml:space="preserve">                        {'normal': 'Normal', 'uniforme': 'Uniforme', 'exponencial': 'Exponencial'}),</w:t>
+              <w:t xml:space="preserve">                        {'normal': 'Normal (Gaussiana)', 'uniforme': 'Uniforme', 'exponencial': 'Exponencial'}),</w:t>
               <w:br/>
               <w:t xml:space="preserve">        ui.input_radio_buttons('color_grafica', 'Color de las Barras:',</w:t>
               <w:br/>
-              <w:t xml:space="preserve">                               {'#2563EB': 'Azul', '#059669': 'Verde', '#DC2626': 'Rojo'}),</w:t>
+              <w:t xml:space="preserve">                               {'#2563EB': 'Azul', '#059669': 'Verde', '#DC2626': 'Rojo', '#7C3AED': 'Púrpura'}),</w:t>
+              <w:br/>
+              <w:t xml:space="preserve">        ui.hr(),</w:t>
+              <w:br/>
+              <w:t xml:space="preserve">        ui.p('Dashboard básico para despliegue en Posit Connect Cloud.', class_='text-muted small'),</w:t>
               <w:br/>
               <w:t xml:space="preserve">        width=280,</w:t>
               <w:br/>
               <w:t xml:space="preserve">    ),</w:t>
               <w:br/>
-              <w:t xml:space="preserve">    ui.h3('📊 Dashboard Básico: Generador de Distribuciones', class_='fw-bold mb-3'),</w:t>
+              <w:t xml:space="preserve">    ui.h3('📊 Dashboard Básico: Generador de Distribuciones Estadísticas', class_='fw-bold mb-3'),</w:t>
               <w:br/>
               <w:t xml:space="preserve">    ui.layout_columns(</w:t>
               <w:br/>
-              <w:t xml:space="preserve">        ui.value_box('Media (x̄)', ui.output_text('kpi_media'), theme='primary'),</w:t>
+              <w:t xml:space="preserve">        ui.value_box('Media Aritmética (x̄)', ui.output_text('kpi_media'), showcase=ui.div('📈', style='font-size: 2rem;'), theme='primary'),</w:t>
               <w:br/>
-              <w:t xml:space="preserve">        ui.value_box('Desv. Est. (σ)', ui.output_text('kpi_desviacion'), theme='success'),</w:t>
+              <w:t xml:space="preserve">        ui.value_box('Desviación Estándar (σ)', ui.output_text('kpi_desviacion'), showcase=ui.div('📏', style='font-size: 2rem;'), theme='success'),</w:t>
               <w:br/>
-              <w:t xml:space="preserve">        ui.value_box('Total Muestras', ui.output_text('kpi_total'), theme='info'),</w:t>
+              <w:t xml:space="preserve">        ui.value_box('Total de Observaciones', ui.output_text('kpi_total'), showcase=ui.div('🔢', style='font-size: 2rem;'), theme='info'),</w:t>
               <w:br/>
               <w:t xml:space="preserve">        col_widths=[4, 4, 4],</w:t>
               <w:br/>
@@ -633,9 +940,9 @@
               <w:br/>
               <w:t xml:space="preserve">    ui.layout_columns(</w:t>
               <w:br/>
-              <w:t xml:space="preserve">        ui.card(ui.card_header('Histograma'), ui.output_plot('grafico_histograma')),</w:t>
+              <w:t xml:space="preserve">        ui.card(ui.card_header('Histograma de Frecuencias en Tiempo Real', class_='fw-bold'), ui.output_plot('grafico_histograma')),</w:t>
               <w:br/>
-              <w:t xml:space="preserve">        ui.card(ui.card_header('Primeras 10 Observaciones'), ui.output_data_frame('tabla_primeros_datos')),</w:t>
+              <w:t xml:space="preserve">        ui.card(ui.card_header('Primeras 10 Observaciones del Conjunto', class_='fw-bold'), ui.output_data_frame('tabla_primeros_datos')),</w:t>
               <w:br/>
               <w:t xml:space="preserve">        col_widths=[7, 5],</w:t>
               <w:br/>
@@ -643,10 +950,16 @@
               <w:br/>
               <w:t xml:space="preserve">    title='Dashboard Básico - Shiny',</w:t>
               <w:br/>
+              <w:t xml:space="preserve">    fillable=True,</w:t>
+              <w:br/>
               <w:t>)</w:t>
               <w:br/>
               <w:br/>
-              <w:t># --- Lógica del Servidor (Server) ---</w:t>
+              <w:t># -----------------------------------------------------------------------------</w:t>
+              <w:br/>
+              <w:t># 2. Lógica del Servidor (Server)</w:t>
+              <w:br/>
+              <w:t># -----------------------------------------------------------------------------</w:t>
               <w:br/>
               <w:t>def server(input, output, session):</w:t>
               <w:br/>
@@ -660,11 +973,11 @@
               <w:br/>
               <w:t xml:space="preserve">        np.random.seed(42)</w:t>
               <w:br/>
-              <w:t xml:space="preserve">        if tipo == 'normal': valores = np.random.normal(50, 10, n)</w:t>
+              <w:t xml:space="preserve">        if tipo == 'normal': valores = np.random.normal(loc=50, scale=10, size=n)</w:t>
               <w:br/>
-              <w:t xml:space="preserve">        elif tipo == 'uniforme': valores = np.random.uniform(20, 80, n)</w:t>
+              <w:t xml:space="preserve">        elif tipo == 'uniforme': valores = np.random.uniform(low=20, high=80, size=n)</w:t>
               <w:br/>
-              <w:t xml:space="preserve">        else: valores = np.random.exponential(20, n)</w:t>
+              <w:t xml:space="preserve">        else: valores = np.random.exponential(scale=20, size=n)</w:t>
               <w:br/>
               <w:t xml:space="preserve">        return pd.DataFrame({'ID': range(1, n + 1), 'Valor': np.round(valores, 2)})</w:t>
               <w:br/>
@@ -673,9 +986,11 @@
               <w:br/>
               <w:t xml:space="preserve">    def kpi_media(): return f"{generar_datos()['Valor'].mean():.2f}"</w:t>
               <w:br/>
+              <w:br/>
               <w:t xml:space="preserve">    @render.text</w:t>
               <w:br/>
               <w:t xml:space="preserve">    def kpi_desviacion(): return f"{generar_datos()['Valor'].std():.2f}"</w:t>
+              <w:br/>
               <w:br/>
               <w:t xml:space="preserve">    @render.text</w:t>
               <w:br/>
@@ -688,19 +1003,44 @@
               <w:br/>
               <w:t xml:space="preserve">        df = generar_datos()</w:t>
               <w:br/>
+              <w:t xml:space="preserve">        color = input.color_grafica()</w:t>
+              <w:br/>
+              <w:t xml:space="preserve">        tipo = input.tipo_distribucion()</w:t>
+              <w:br/>
               <w:t xml:space="preserve">        fig, ax = plt.subplots(figsize=(6, 4))</w:t>
               <w:br/>
-              <w:t xml:space="preserve">        ax.hist(df['Valor'], bins=15, color=input.color_grafica(), edgecolor='black')</w:t>
+              <w:t xml:space="preserve">        ax.hist(df['Valor'], bins=15, color=color, edgecolor='black', alpha=0.75)</w:t>
+              <w:br/>
+              <w:t xml:space="preserve">        ax.set_title(f'Histograma de Distribución: {tipo.capitalize()}', fontsize=12, fontweight='bold')</w:t>
+              <w:br/>
+              <w:t xml:space="preserve">        ax.set_xlabel('Valor de la Variable', fontsize=10)</w:t>
+              <w:br/>
+              <w:t xml:space="preserve">        ax.set_ylabel('Frecuencia Absoluta', fontsize=10)</w:t>
+              <w:br/>
+              <w:t xml:space="preserve">        ax.grid(axis='y', linestyle='--', alpha=0.7)</w:t>
+              <w:br/>
+              <w:t xml:space="preserve">        plt.tight_layout()</w:t>
               <w:br/>
               <w:t xml:space="preserve">        return fig</w:t>
               <w:br/>
               <w:br/>
               <w:t xml:space="preserve">    @render.data_frame</w:t>
               <w:br/>
-              <w:t xml:space="preserve">    def tabla_primeros_datos(): return render.DataGrid(generar_datos().head(10))</w:t>
+              <w:t xml:space="preserve">    def tabla_primeros_datos():</w:t>
+              <w:br/>
+              <w:t xml:space="preserve">        df = generar_datos()</w:t>
+              <w:br/>
+              <w:t xml:space="preserve">        return render.DataGrid(df.head(10))</w:t>
               <w:br/>
               <w:br/>
+              <w:t># -----------------------------------------------------------------------------</w:t>
+              <w:br/>
+              <w:t># 3. Inicialización y Ejecución de la App</w:t>
+              <w:br/>
+              <w:t># -----------------------------------------------------------------------------</w:t>
+              <w:br/>
               <w:t>app = App(app_ui, server)</w:t>
+              <w:br/>
               <w:br/>
               <w:t>if __name__ == '__main__':</w:t>
               <w:br/>
@@ -716,68 +1056,33 @@
       </w:pPr>
     </w:p>
     <w:p>
-      <w:pPr>
-        <w:spacing w:before="120"/>
-      </w:pPr>
-    </w:p>
-    <w:p>
-      <w:pPr>
-        <w:jc w:val="center"/>
-      </w:pPr>
       <w:r>
-        <w:drawing>
-          <wp:inline xmlns:a="http://schemas.openxmlformats.org/drawingml/2006/main" xmlns:pic="http://schemas.openxmlformats.org/drawingml/2006/picture">
-            <wp:extent cx="5029200" cy="2698773"/>
-            <wp:docPr id="2" name="Picture 2"/>
-            <wp:cNvGraphicFramePr>
-              <a:graphicFrameLocks noChangeAspect="1"/>
-            </wp:cNvGraphicFramePr>
-            <a:graphic>
-              <a:graphicData uri="http://schemas.openxmlformats.org/drawingml/2006/picture">
-                <pic:pic>
-                  <pic:nvPicPr>
-                    <pic:cNvPr id="0" name="grafica_histograma.png"/>
-                    <pic:cNvPicPr/>
-                  </pic:nvPicPr>
-                  <pic:blipFill>
-                    <a:blip r:embed="rId10"/>
-                    <a:stretch>
-                      <a:fillRect/>
-                    </a:stretch>
-                  </pic:blipFill>
-                  <pic:spPr>
-                    <a:xfrm>
-                      <a:off x="0" y="0"/>
-                      <a:ext cx="5029200" cy="2698773"/>
-                    </a:xfrm>
-                    <a:prstGeom prst="rect"/>
-                  </pic:spPr>
-                </pic:pic>
-              </a:graphicData>
-            </a:graphic>
-          </wp:inline>
-        </w:drawing>
+        <w:br w:type="page"/>
       </w:r>
     </w:p>
     <w:p>
       <w:pPr>
-        <w:jc w:val="center"/>
+        <w:pStyle w:val="Heading1"/>
       </w:pPr>
       <w:r>
-        <w:t>Figura 2: Histograma generado de forma reactiva por el Dashboard Básico.</w:t>
-      </w:r>
-    </w:p>
-    <w:p>
-      <w:pPr>
-        <w:pStyle w:val="Heading2"/>
-      </w:pPr>
-      <w:r>
-        <w:t>3.4 Archivo de Requisitos (requirements.txt)</w:t>
+        <w:t>5. Cómo se Inicializa y Ejecuta la Aplicación</w:t>
       </w:r>
     </w:p>
     <w:p>
       <w:r>
-        <w:t>Librerías declaradas de forma concisa para el contenedor en la nube:</w:t>
+        <w:t>Una aplicación Shiny for Python puede inicializarse de dos formas en la computadora local. Ambas opciones levantan un servidor web local y permiten visualizar la interfaz desde el navegador:</w:t>
+      </w:r>
+    </w:p>
+    <w:p>
+      <w:r>
+        <w:rPr>
+          <w:b/>
+        </w:rPr>
+        <w:t>Método 1: Ejecución con el Servidor CLI de Shiny (Recomendado para desarrollo)</w:t>
+        <w:br/>
+      </w:r>
+      <w:r>
+        <w:t>El comando oficial de Shiny incluye la bandera --reload, la cual detecta automáticamente cualquier cambio guardado en app.py y recarga el navegador al instante sin necesidad de reiniciar la terminal:</w:t>
       </w:r>
     </w:p>
     <w:tbl>
@@ -807,13 +1112,14 @@
                 <w:color w:val="0F172A"/>
                 <w:sz w:val="17"/>
               </w:rPr>
-              <w:t>shiny&gt;=1.0.0</w:t>
+              <w:t># 1. Asegurarse de estar en la carpeta donde reside app.py:</w:t>
               <w:br/>
-              <w:t>numpy&gt;=1.24.0</w:t>
+              <w:t>cd "c:\Users\rolca\Documents\Prog. CD\Dashboard_Basico_Shiny"</w:t>
               <w:br/>
-              <w:t>pandas&gt;=2.0.0</w:t>
               <w:br/>
-              <w:t>matplotlib&gt;=3.7.0</w:t>
+              <w:t># 2. Ejecutar con el servidor de desarrollo de Shiny:</w:t>
+              <w:br/>
+              <w:t>shiny run --reload --port 8000 app.py</w:t>
             </w:r>
           </w:p>
         </w:tc>
@@ -825,16 +1131,15 @@
       </w:pPr>
     </w:p>
     <w:p>
-      <w:pPr>
-        <w:pStyle w:val="Heading2"/>
-      </w:pPr>
       <w:r>
-        <w:t>3.5 Ejecución Local</w:t>
+        <w:rPr>
+          <w:b/>
+        </w:rPr>
+        <w:t>Método 2: Ejecución directa con el intérprete de Python</w:t>
+        <w:br/>
       </w:r>
-    </w:p>
-    <w:p>
       <w:r>
-        <w:t>Para ejecutar y probar la aplicación en la computadora local:</w:t>
+        <w:t>Gracias al bloque añadido al final del código (if __name__ == '__main__': app.run(port=8000)), la aplicación también puede levantarse como cualquier script convencional de Python:</w:t>
       </w:r>
     </w:p>
     <w:tbl>
@@ -864,17 +1169,9 @@
                 <w:color w:val="0F172A"/>
                 <w:sz w:val="17"/>
               </w:rPr>
-              <w:t># Opción 1: Servidor Shiny de recarga automática</w:t>
-              <w:br/>
-              <w:t>shiny run --reload --port 8000 app.py</w:t>
-              <w:br/>
-              <w:br/>
-              <w:t># Opción 2: Ejecución directa con Python</w:t>
+              <w:t># Ubicado dentro de Dashboard_Basico_Shiny:</w:t>
               <w:br/>
               <w:t>python app.py</w:t>
-              <w:br/>
-              <w:br/>
-              <w:t># Abrir en el navegador: http://127.0.0.1:8000</w:t>
             </w:r>
           </w:p>
         </w:tc>
@@ -887,7 +1184,11 @@
     </w:p>
     <w:p>
       <w:r>
-        <w:br w:type="page"/>
+        <w:t>Acceso en el Navegador Web:</w:t>
+        <w:br/>
+        <w:t>Una vez que la terminal muestra el mensaje 'Uvicorn running on http://127.0.0.1:8000', abre cualquier navegador (Chrome, Edge, Firefox) y navega a la dirección:</w:t>
+        <w:br/>
+        <w:t>👉 http://127.0.0.1:8000  (o http://localhost:8000)</w:t>
       </w:r>
     </w:p>
     <w:p>
@@ -895,12 +1196,12 @@
         <w:pStyle w:val="Heading1"/>
       </w:pPr>
       <w:r>
-        <w:t>4. Tramitación de la Cuenta en Posit y GitHub</w:t>
+        <w:t>6. Resolución de Incidencias Comunes Durante la Práctica</w:t>
       </w:r>
     </w:p>
     <w:p>
       <w:r>
-        <w:t>Para poner la aplicación al alcance del público, se tramitó la cuenta oficial en la plataforma en la nube de Posit y se creó el repositorio de código abierto en GitHub.</w:t>
+        <w:t>Durante el desarrollo y prueba de aplicaciones web en terminal, es habitual toparse con errores de entorno o de rutas. A continuación se documentan las dos incidencias experimentadas y su solución definitiva:</w:t>
       </w:r>
     </w:p>
     <w:p>
@@ -908,17 +1209,13 @@
         <w:rPr>
           <w:b/>
         </w:rPr>
-        <w:t>4.1 Cuenta en Posit Connect Cloud</w:t>
+        <w:t>Incidencia 1: Error '.\app.py not found'</w:t>
         <w:br/>
       </w:r>
       <w:r>
-        <w:t>• Plataforma: Posit Connect Cloud (servicio oficial gestionado de Posit).</w:t>
+        <w:t>• Causa: Este error ocurre cuando se intenta ejecutar 'shiny run app.py' o 'python app.py' estando ubicado en la carpeta padre (por ejemplo en 'c:\Users\rolca\Documents\Prog. CD') en lugar de la subcarpeta donde realmente se encuentra el archivo app.py.</w:t>
         <w:br/>
-        <w:t>• URL de la cuenta tramitada: https://connect.posit.cloud/rncm11</w:t>
-        <w:br/>
-        <w:t>• Nombre de usuario / Cuenta: rncm11</w:t>
-        <w:br/>
-        <w:t>• Plan utilizado: Gratuito (incluye publicación de aplicaciones Shiny para Python sin costo).</w:t>
+        <w:t>• Solución: Cambiar de directorio en la terminal antes de lanzar la aplicación ejecutando: cd "Dashboard_Basico_Shiny".</w:t>
       </w:r>
     </w:p>
     <w:p>
@@ -926,15 +1223,64 @@
         <w:rPr>
           <w:b/>
         </w:rPr>
-        <w:t>4.2 Repositorio en GitHub</w:t>
+        <w:t>Incidencia 2: 'Import Jinja2 failed. DataFrame.style requires jinja2'</w:t>
+        <w:br/>
+      </w:r>
+      <w:r>
+        <w:t>• Causa: Al utilizar la directiva antigua @render.table con un DataFrame de Pandas, la función interna intenta invocar el formateador CSS DataFrame.style, el cual depende obligatoriamente del paquete externo Jinja2.</w:t>
+        <w:br/>
+        <w:t>• Solución Doble Aplicada:</w:t>
+        <w:br/>
+        <w:t xml:space="preserve">  1. Se actualizó app.py utilizando la directiva moderna @render.data_frame con render.DataGrid, la cual es nativa de Shiny, más rápida y no requiere Jinja2 para tablas básicas.</w:t>
+        <w:br/>
+        <w:t xml:space="preserve">  2. Se agregó 'jinja2&gt;=3.1.0' al archivo requirements.txt para asegurar que los servidores de Posit cuenten con todas las dependencias.</w:t>
+      </w:r>
+    </w:p>
+    <w:p>
+      <w:pPr>
+        <w:pStyle w:val="Heading1"/>
+      </w:pPr>
+      <w:r>
+        <w:t>7. Tramitación de Cuenta en Posit Connect Cloud y Publicación</w:t>
+      </w:r>
+    </w:p>
+    <w:p>
+      <w:r>
+        <w:t>Para cumplir con el objetivo de publicar la aplicación en internet y ponerla al alcance de cualquier usuario en el mundo, se realizaron los siguientes trámites y configuraciones:</w:t>
+      </w:r>
+    </w:p>
+    <w:p>
+      <w:r>
+        <w:rPr>
+          <w:b/>
+        </w:rPr>
+        <w:t>7.1 Tramitación de la Cuenta en Posit Connect Cloud</w:t>
+        <w:br/>
+      </w:r>
+      <w:r>
+        <w:t>• Portal de acceso: https://connect.posit.cloud/</w:t>
+        <w:br/>
+        <w:t>• Nombre de usuario / Cuenta registrada: rncm11</w:t>
+        <w:br/>
+        <w:t>• Perfil y panel de aplicaciones activas: https://connect.posit.cloud/rncm11</w:t>
+        <w:br/>
+        <w:t>• Tipo de plan: Gratuito (Cloud Free Tier), ideal para prácticas académicas sin costo de servidor.</w:t>
+      </w:r>
+    </w:p>
+    <w:p>
+      <w:r>
+        <w:rPr>
+          <w:b/>
+        </w:rPr>
+        <w:t>7.2 Creación del Repositorio en GitHub</w:t>
         <w:br/>
       </w:r>
       <w:r>
         <w:t>• Nombre del repositorio: Shiny-Prog-CD</w:t>
         <w:br/>
-        <w:t>• URL pública: https://github.com/RolandoCastillo11/Shiny-Prog-CD</w:t>
+        <w:t>• URL pública del código: https://github.com/RolandoCastillo11/Shiny-Prog-CD</w:t>
         <w:br/>
-        <w:t>• Comandos de inicialización y sincronización ejecutados:</w:t>
+        <w:t>• Comandos ejecutados para sincronizar el proyecto local con GitHub:</w:t>
         <w:br/>
       </w:r>
     </w:p>
@@ -969,7 +1315,7 @@
               <w:br/>
               <w:t>git add .</w:t>
               <w:br/>
-              <w:t>git commit -m "first commit"</w:t>
+              <w:t>git commit -m "Refactor: Dashboard basico simplificado y reporte de instalacion actualizado"</w:t>
               <w:br/>
               <w:t>git branch -M main</w:t>
               <w:br/>
@@ -987,38 +1333,25 @@
       </w:pPr>
     </w:p>
     <w:p>
-      <w:pPr>
-        <w:pStyle w:val="Heading1"/>
-      </w:pPr>
-      <w:r>
-        <w:t>5. Publicación del Dashboard en Internet</w:t>
-      </w:r>
-    </w:p>
-    <w:p>
-      <w:r>
-        <w:t>Con el código disponible en GitHub y la cuenta activa en Posit Connect Cloud, el despliegue se realiza directamente desde la interfaz web de Posit:</w:t>
-      </w:r>
-    </w:p>
-    <w:p>
       <w:r>
         <w:rPr>
           <w:b/>
         </w:rPr>
-        <w:t>Pasos de Publicación en Posit Connect Cloud:</w:t>
+        <w:t>7.3 Publicación Final en la Nube de Posit</w:t>
         <w:br/>
       </w:r>
       <w:r>
-        <w:t>1. Iniciar sesión en https://connect.posit.cloud/rncm11</w:t>
+        <w:t>Desde el panel web de https://connect.posit.cloud/rncm11:</w:t>
         <w:br/>
-        <w:t>2. Hacer clic en el botón 'Publish' (esquina superior derecha).</w:t>
+        <w:t>1. Se pulsa el botón 'Publish' situado en la parte superior derecha.</w:t>
         <w:br/>
-        <w:t>3. Seleccionar la fuente 'GitHub' y vincular la cuenta RolandoCastillo11.</w:t>
+        <w:t>2. Se selecciona la fuente de despliegue 'GitHub' y se autoriza la cuenta RolandoCastillo11.</w:t>
         <w:br/>
-        <w:t>4. Elegir el repositorio Shiny-Prog-CD.</w:t>
+        <w:t>3. Se elige el repositorio Shiny-Prog-CD.</w:t>
         <w:br/>
-        <w:t>5. Posit detecta automáticamente el archivo app.py y el archivo requirements.txt.</w:t>
+        <w:t>4. Posit Connect Cloud detecta automáticamente app.py como punto de entrada y requirements.txt como dependencias.</w:t>
         <w:br/>
-        <w:t>6. Hacer clic en 'Deploy'. Posit construye el contenedor Docker, instala las librerías y activa el enlace web público.</w:t>
+        <w:t>5. Al presionar 'Deploy', el clúster de Posit compila el contenedor Docker en Linux y genera la URL pública con protocolo seguro HTTPS.</w:t>
       </w:r>
     </w:p>
     <w:p>
@@ -1026,7 +1359,7 @@
         <w:pStyle w:val="Heading1"/>
       </w:pPr>
       <w:r>
-        <w:t>6. Resumen de Actividades Realizadas</w:t>
+        <w:t>8. Resumen de Actividades y Verificación</w:t>
       </w:r>
     </w:p>
     <w:tbl>
@@ -1036,9 +1369,9 @@
         <w:tblLook w:firstColumn="1" w:firstRow="1" w:lastColumn="0" w:lastRow="0" w:noHBand="0" w:noVBand="1" w:val="04A0"/>
       </w:tblPr>
       <w:tblGrid>
-        <w:gridCol w:w="2592"/>
-        <w:gridCol w:w="3888"/>
         <w:gridCol w:w="2880"/>
+        <w:gridCol w:w="3744"/>
+        <w:gridCol w:w="2736"/>
       </w:tblGrid>
       <w:tr>
         <w:tc>
@@ -1053,7 +1386,7 @@
                 <w:color w:val="FFFFFF"/>
                 <w:sz w:val="19"/>
               </w:rPr>
-              <w:t>Actividad</w:t>
+              <w:t>Actividad Requerida</w:t>
             </w:r>
           </w:p>
         </w:tc>
@@ -1069,7 +1402,7 @@
                 <w:color w:val="FFFFFF"/>
                 <w:sz w:val="19"/>
               </w:rPr>
-              <w:t>Detalle / Herramienta</w:t>
+              <w:t>Herramienta / Evidencia</w:t>
             </w:r>
           </w:p>
         </w:tc>
@@ -1085,7 +1418,7 @@
                 <w:color w:val="FFFFFF"/>
                 <w:sz w:val="19"/>
               </w:rPr>
-              <w:t>Estado</w:t>
+              <w:t>Estado de Verificación</w:t>
             </w:r>
           </w:p>
         </w:tc>
@@ -1101,7 +1434,7 @@
               <w:rPr>
                 <w:sz w:val="18"/>
               </w:rPr>
-              <w:t>Instalación de Shiny</w:t>
+              <w:t>1. Instalación de Shiny</w:t>
             </w:r>
           </w:p>
         </w:tc>
@@ -1131,7 +1464,7 @@
                 <w:color w:val="059669"/>
                 <w:sz w:val="18"/>
               </w:rPr>
-              <w:t>Completada ✓</w:t>
+              <w:t>Completada y Verificada ✓</w:t>
             </w:r>
           </w:p>
         </w:tc>
@@ -1147,7 +1480,7 @@
               <w:rPr>
                 <w:sz w:val="18"/>
               </w:rPr>
-              <w:t>Desarrollo del Dashboard</w:t>
+              <w:t>2. Dashboard Básico</w:t>
             </w:r>
           </w:p>
         </w:tc>
@@ -1161,7 +1494,7 @@
               <w:rPr>
                 <w:sz w:val="18"/>
               </w:rPr>
-              <w:t>app.py (Histograma + KPIs + Tabla)</w:t>
+              <w:t>app.py (Inputs, KPIs, Histograma, Tabla)</w:t>
             </w:r>
           </w:p>
         </w:tc>
@@ -1177,7 +1510,7 @@
                 <w:color w:val="059669"/>
                 <w:sz w:val="18"/>
               </w:rPr>
-              <w:t>Completado y Probado ✓</w:t>
+              <w:t>Completado y Funcionando ✓</w:t>
             </w:r>
           </w:p>
         </w:tc>
@@ -1193,7 +1526,7 @@
               <w:rPr>
                 <w:sz w:val="18"/>
               </w:rPr>
-              <w:t>Tramitación en Posit</w:t>
+              <w:t>3. Inicialización Local</w:t>
             </w:r>
           </w:p>
         </w:tc>
@@ -1201,6 +1534,52 @@
           <w:tcPr>
             <w:tcW w:type="dxa" w:w="3120"/>
             <w:shd w:fill="FFFFFF"/>
+          </w:tcPr>
+          <w:p>
+            <w:r>
+              <w:rPr>
+                <w:sz w:val="18"/>
+              </w:rPr>
+              <w:t>shiny run --reload / python app.py</w:t>
+            </w:r>
+          </w:p>
+        </w:tc>
+        <w:tc>
+          <w:tcPr>
+            <w:tcW w:type="dxa" w:w="3120"/>
+            <w:shd w:fill="ECFDF5"/>
+          </w:tcPr>
+          <w:p>
+            <w:r>
+              <w:rPr>
+                <w:b/>
+                <w:color w:val="059669"/>
+                <w:sz w:val="18"/>
+              </w:rPr>
+              <w:t>Probado en http://127.0.0.1:8000 ✓</w:t>
+            </w:r>
+          </w:p>
+        </w:tc>
+      </w:tr>
+      <w:tr>
+        <w:tc>
+          <w:tcPr>
+            <w:tcW w:type="dxa" w:w="3120"/>
+            <w:shd w:fill="F8FAFC"/>
+          </w:tcPr>
+          <w:p>
+            <w:r>
+              <w:rPr>
+                <w:sz w:val="18"/>
+              </w:rPr>
+              <w:t>4. Tramitación en Posit</w:t>
+            </w:r>
+          </w:p>
+        </w:tc>
+        <w:tc>
+          <w:tcPr>
+            <w:tcW w:type="dxa" w:w="3120"/>
+            <w:shd w:fill="F8FAFC"/>
           </w:tcPr>
           <w:p>
             <w:r>
@@ -1223,7 +1602,7 @@
                 <w:color w:val="059669"/>
                 <w:sz w:val="18"/>
               </w:rPr>
-              <w:t>Cuenta Activa ✓</w:t>
+              <w:t>Cuenta Activa Tramitada ✓</w:t>
             </w:r>
           </w:p>
         </w:tc>
@@ -1232,21 +1611,21 @@
         <w:tc>
           <w:tcPr>
             <w:tcW w:type="dxa" w:w="3120"/>
-            <w:shd w:fill="F8FAFC"/>
+            <w:shd w:fill="FFFFFF"/>
           </w:tcPr>
           <w:p>
             <w:r>
               <w:rPr>
                 <w:sz w:val="18"/>
               </w:rPr>
-              <w:t>Repositorio GitHub</w:t>
+              <w:t>5. Sincronización GitHub</w:t>
             </w:r>
           </w:p>
         </w:tc>
         <w:tc>
           <w:tcPr>
             <w:tcW w:type="dxa" w:w="3120"/>
-            <w:shd w:fill="F8FAFC"/>
+            <w:shd w:fill="FFFFFF"/>
           </w:tcPr>
           <w:p>
             <w:r>
@@ -1269,53 +1648,7 @@
                 <w:color w:val="059669"/>
                 <w:sz w:val="18"/>
               </w:rPr>
-              <w:t>Código Publicado ✓</w:t>
-            </w:r>
-          </w:p>
-        </w:tc>
-      </w:tr>
-      <w:tr>
-        <w:tc>
-          <w:tcPr>
-            <w:tcW w:type="dxa" w:w="3120"/>
-            <w:shd w:fill="FFFFFF"/>
-          </w:tcPr>
-          <w:p>
-            <w:r>
-              <w:rPr>
-                <w:sz w:val="18"/>
-              </w:rPr>
-              <w:t>Documentación Formal</w:t>
-            </w:r>
-          </w:p>
-        </w:tc>
-        <w:tc>
-          <w:tcPr>
-            <w:tcW w:type="dxa" w:w="3120"/>
-            <w:shd w:fill="FFFFFF"/>
-          </w:tcPr>
-          <w:p>
-            <w:r>
-              <w:rPr>
-                <w:sz w:val="18"/>
-              </w:rPr>
-              <w:t>Reporte en Word (.docx) y PDF (.pdf)</w:t>
-            </w:r>
-          </w:p>
-        </w:tc>
-        <w:tc>
-          <w:tcPr>
-            <w:tcW w:type="dxa" w:w="3120"/>
-            <w:shd w:fill="ECFDF5"/>
-          </w:tcPr>
-          <w:p>
-            <w:r>
-              <w:rPr>
-                <w:b/>
-                <w:color w:val="059669"/>
-                <w:sz w:val="18"/>
-              </w:rPr>
-              <w:t>Generado ✓</w:t>
+              <w:t>Código Publicado en Git ✓</w:t>
             </w:r>
           </w:p>
         </w:tc>
@@ -1331,18 +1664,18 @@
         <w:pStyle w:val="Heading1"/>
       </w:pPr>
       <w:r>
-        <w:t>7. Conclusiones</w:t>
+        <w:t>9. Conclusiones</w:t>
       </w:r>
     </w:p>
     <w:p>
       <w:r>
-        <w:t>1. Shiny for Python permite construir herramientas analíticas interactivas con una curva de aprendizaje mínima, utilizando estructuras limpias que separan la interfaz de usuario (UI) de la lógica del servidor (Server).</w:t>
+        <w:t>1. Shiny for Python se consolida como una herramienta esencial para la ciencia de datos moderna, permitiendo transformar scripts analíticos estáticos en aplicaciones web dinámicas con un mínimo esfuerzo de código.</w:t>
         <w:br/>
         <w:br/>
-        <w:t>2. La reactividad mediante decoradores (@reactive.calc y @render) simplifica enormemente la sincronización entre los controles visuales y los cálculos numéricos en tiempo real.</w:t>
+        <w:t>2. La arquitectura basada en decoradores reactivos (@reactive.calc y @render) simplifica el manejo del estado de la aplicación, garantizando que los cálculos se actualicen exclusivamente cuando cambian los controles del usuario.</w:t>
         <w:br/>
         <w:br/>
-        <w:t>3. La combinación de GitHub con Posit Connect Cloud ofrece un flujo de despliegue continuo (CI/CD) ágil, permitiendo que cualquier estudiante o profesional comparta sus tableros de ciencia de datos con el mundo sin necesidad de gestionar servidores físicos ni configuraciones complejas.</w:t>
+        <w:t>3. La integración entre repositorios de GitHub y la plataforma Posit Connect Cloud permite implementar un flujo profesional de integración y despliegue continuo (CI/CD), asegurando que cualquier cambio en el código se publique en internet de forma automatizada, transparente y segura.</w:t>
       </w:r>
     </w:p>
     <w:sectPr>

</xml_diff>